<commit_message>
Remove Nali Kali, GKA kit and PARAKH learning-gap notes from Annexure-1 feedback documents
Co-Authored-By: Claude Opus 5.5 <noreply@anthropic.com>
Claude-Session: https://claude.ai/code/session_01TmoA8EnDu8b3BBjWmeLWrr
</commit_message>
<xml_diff>
--- a/rewrites/cs-conference-feedback/Monograde_Education_Feedback_Notes_Annexure1.docx
+++ b/rewrites/cs-conference-feedback/Monograde_Education_Feedback_Notes_Annexure1.docx
@@ -43,7 +43,7 @@
           <w:sz w:val="24"/>
           <w:u w:val="none"/>
         </w:rPr>
-        <w:t>Shift from Nali Kali (Multigrade) to Single-Grade Classrooms in Government Primary Schools of Karnataka</w:t>
+        <w:t>Single-Grade (Monograde) Classrooms in Government Primary Schools of Karnataka</w:t>
       </w:r>
     </w:p>
     <w:p>
@@ -224,7 +224,7 @@
               <w:rPr>
                 <w:sz w:val="20"/>
               </w:rPr>
-              <w:t>Shift from Nali Kali (Multigrade) to Monograde Classrooms in Classes 1 to 3</w:t>
+              <w:t>One Teacher for Each Class in Monograde Primary Schools</w:t>
             </w:r>
           </w:p>
         </w:tc>
@@ -280,7 +280,7 @@
               <w:rPr>
                 <w:sz w:val="20"/>
               </w:rPr>
-              <w:t>One Teacher for Each Class in Monograde Primary Schools</w:t>
+              <w:t>Classrooms, Furniture and Learning Materials for Monograde Classes</w:t>
             </w:r>
           </w:p>
         </w:tc>
@@ -336,7 +336,7 @@
               <w:rPr>
                 <w:sz w:val="20"/>
               </w:rPr>
-              <w:t>Classrooms, Furniture and Learning Materials for Monograde Classes</w:t>
+              <w:t>Teacher Preparation for Monograde Teaching</w:t>
             </w:r>
           </w:p>
         </w:tc>
@@ -392,7 +392,7 @@
               <w:rPr>
                 <w:sz w:val="20"/>
               </w:rPr>
-              <w:t>Teacher Preparation for Monograde Teaching</w:t>
+              <w:t>Small Schools and Single-Teacher Schools in the Monograde System</w:t>
             </w:r>
           </w:p>
         </w:tc>
@@ -448,7 +448,7 @@
               <w:rPr>
                 <w:sz w:val="20"/>
               </w:rPr>
-              <w:t>Retaining Activity-Based and Joyful Learning in Monograde Classrooms</w:t>
+              <w:t>Monitoring Foundational Literacy and Numeracy during the Transition</w:t>
             </w:r>
           </w:p>
         </w:tc>
@@ -504,118 +504,6 @@
               <w:rPr>
                 <w:sz w:val="20"/>
               </w:rPr>
-              <w:t>Small Schools and Single-Teacher Schools in the Monograde System</w:t>
-            </w:r>
-          </w:p>
-        </w:tc>
-        <w:tc>
-          <w:tcPr>
-            <w:tcW w:type="dxa" w:w="2736"/>
-          </w:tcPr>
-          <w:p>
-            <w:pPr>
-              <w:spacing w:after="0"/>
-            </w:pPr>
-            <w:r/>
-            <w:r>
-              <w:rPr>
-                <w:sz w:val="20"/>
-              </w:rPr>
-              <w:t>DSERT, Bengaluru</w:t>
-            </w:r>
-          </w:p>
-        </w:tc>
-      </w:tr>
-      <w:tr>
-        <w:trPr>
-          <w:cantSplit/>
-        </w:trPr>
-        <w:tc>
-          <w:tcPr>
-            <w:tcW w:type="dxa" w:w="720"/>
-          </w:tcPr>
-          <w:p>
-            <w:pPr>
-              <w:spacing w:after="0"/>
-            </w:pPr>
-            <w:r/>
-            <w:r>
-              <w:rPr>
-                <w:sz w:val="20"/>
-              </w:rPr>
-              <w:t>7</w:t>
-            </w:r>
-          </w:p>
-        </w:tc>
-        <w:tc>
-          <w:tcPr>
-            <w:tcW w:type="dxa" w:w="5616"/>
-          </w:tcPr>
-          <w:p>
-            <w:pPr>
-              <w:spacing w:after="0"/>
-            </w:pPr>
-            <w:r/>
-            <w:r>
-              <w:rPr>
-                <w:sz w:val="20"/>
-              </w:rPr>
-              <w:t>Monitoring Foundational Literacy and Numeracy during the Transition</w:t>
-            </w:r>
-          </w:p>
-        </w:tc>
-        <w:tc>
-          <w:tcPr>
-            <w:tcW w:type="dxa" w:w="2736"/>
-          </w:tcPr>
-          <w:p>
-            <w:pPr>
-              <w:spacing w:after="0"/>
-            </w:pPr>
-            <w:r/>
-            <w:r>
-              <w:rPr>
-                <w:sz w:val="20"/>
-              </w:rPr>
-              <w:t>DSERT, Bengaluru</w:t>
-            </w:r>
-          </w:p>
-        </w:tc>
-      </w:tr>
-      <w:tr>
-        <w:trPr>
-          <w:cantSplit/>
-        </w:trPr>
-        <w:tc>
-          <w:tcPr>
-            <w:tcW w:type="dxa" w:w="720"/>
-          </w:tcPr>
-          <w:p>
-            <w:pPr>
-              <w:spacing w:after="0"/>
-            </w:pPr>
-            <w:r/>
-            <w:r>
-              <w:rPr>
-                <w:sz w:val="20"/>
-              </w:rPr>
-              <w:t>8</w:t>
-            </w:r>
-          </w:p>
-        </w:tc>
-        <w:tc>
-          <w:tcPr>
-            <w:tcW w:type="dxa" w:w="5616"/>
-          </w:tcPr>
-          <w:p>
-            <w:pPr>
-              <w:spacing w:after="0"/>
-            </w:pPr>
-            <w:r/>
-            <w:r>
-              <w:rPr>
-                <w:sz w:val="20"/>
-              </w:rPr>
               <w:t>Monograde Education: Classroom Visits by BRPs, CRPs and DIET Faculty; Feedback to Teachers; Data and Reporting Requirements; Escalation and Resolution of Problems</w:t>
             </w:r>
           </w:p>
@@ -655,7 +543,7 @@
               <w:rPr>
                 <w:sz w:val="20"/>
               </w:rPr>
-              <w:t>9</w:t>
+              <w:t>7</w:t>
             </w:r>
           </w:p>
         </w:tc>
@@ -727,807 +615,6 @@
           <w:u w:val="none"/>
         </w:rPr>
         <w:t>Feedback Note 1</w:t>
-      </w:r>
-    </w:p>
-    <w:p>
-      <w:pPr>
-        <w:spacing w:after="160" w:before="0"/>
-        <w:jc w:val="center"/>
-      </w:pPr>
-      <w:r>
-        <w:rPr>
-          <w:b w:val="0"/>
-          <w:i/>
-          <w:sz w:val="20"/>
-          <w:u w:val="none"/>
-        </w:rPr>
-        <w:t>(by all IAS officers / State Department Officers / All Probationers of National and State Training Institutes and Academies)</w:t>
-      </w:r>
-    </w:p>
-    <w:p>
-      <w:pPr>
-        <w:spacing w:after="120" w:before="160"/>
-      </w:pPr>
-      <w:r>
-        <w:rPr>
-          <w:b/>
-          <w:i w:val="0"/>
-          <w:sz w:val="24"/>
-          <w:u w:val="none"/>
-        </w:rPr>
-        <w:t>Section 1: Officer Name and Details</w:t>
-      </w:r>
-    </w:p>
-    <w:tbl>
-      <w:tblPr>
-        <w:tblW w:type="auto" w:w="0"/>
-        <w:tblLook w:firstColumn="1" w:firstRow="1" w:lastColumn="0" w:lastRow="0" w:noHBand="0" w:noVBand="1" w:val="04A0"/>
-        <w:tblBorders>
-          <w:top w:val="single" w:sz="4" w:color="000000"/>
-          <w:left w:val="single" w:sz="4" w:color="000000"/>
-          <w:bottom w:val="single" w:sz="4" w:color="000000"/>
-          <w:right w:val="single" w:sz="4" w:color="000000"/>
-          <w:insideH w:val="single" w:sz="4" w:color="000000"/>
-          <w:insideV w:val="single" w:sz="4" w:color="000000"/>
-        </w:tblBorders>
-      </w:tblPr>
-      <w:tblGrid>
-        <w:gridCol w:w="4513"/>
-        <w:gridCol w:w="4513"/>
-      </w:tblGrid>
-      <w:tr>
-        <w:tc>
-          <w:tcPr>
-            <w:tcW w:type="dxa" w:w="3312"/>
-            <w:shd w:val="clear" w:color="auto" w:fill="F2F2F2"/>
-          </w:tcPr>
-          <w:p>
-            <w:pPr>
-              <w:spacing w:after="0"/>
-            </w:pPr>
-            <w:r/>
-            <w:r>
-              <w:rPr>
-                <w:b/>
-              </w:rPr>
-              <w:t>Name</w:t>
-            </w:r>
-          </w:p>
-        </w:tc>
-        <w:tc>
-          <w:tcPr>
-            <w:tcW w:type="dxa" w:w="5760"/>
-          </w:tcPr>
-          <w:p>
-            <w:pPr>
-              <w:spacing w:after="0"/>
-            </w:pPr>
-            <w:r/>
-            <w:r>
-              <w:t>Dr. Padmashree R.P.</w:t>
-            </w:r>
-          </w:p>
-        </w:tc>
-      </w:tr>
-      <w:tr>
-        <w:tc>
-          <w:tcPr>
-            <w:tcW w:type="dxa" w:w="3312"/>
-            <w:shd w:val="clear" w:color="auto" w:fill="F2F2F2"/>
-          </w:tcPr>
-          <w:p>
-            <w:pPr>
-              <w:spacing w:after="0"/>
-            </w:pPr>
-            <w:r/>
-            <w:r>
-              <w:rPr>
-                <w:b/>
-              </w:rPr>
-              <w:t>Designation</w:t>
-            </w:r>
-          </w:p>
-        </w:tc>
-        <w:tc>
-          <w:tcPr>
-            <w:tcW w:type="dxa" w:w="5760"/>
-          </w:tcPr>
-          <w:p>
-            <w:pPr>
-              <w:spacing w:after="0"/>
-            </w:pPr>
-            <w:r/>
-            <w:r>
-              <w:t>Senior Assistant Director, Teacher Education and Research Wing</w:t>
-            </w:r>
-          </w:p>
-        </w:tc>
-      </w:tr>
-      <w:tr>
-        <w:tc>
-          <w:tcPr>
-            <w:tcW w:type="dxa" w:w="3312"/>
-            <w:shd w:val="clear" w:color="auto" w:fill="F2F2F2"/>
-          </w:tcPr>
-          <w:p>
-            <w:pPr>
-              <w:spacing w:after="0"/>
-            </w:pPr>
-            <w:r/>
-            <w:r>
-              <w:rPr>
-                <w:b/>
-              </w:rPr>
-              <w:t>Batch</w:t>
-            </w:r>
-          </w:p>
-        </w:tc>
-        <w:tc>
-          <w:tcPr>
-            <w:tcW w:type="dxa" w:w="5760"/>
-          </w:tcPr>
-          <w:p>
-            <w:pPr>
-              <w:spacing w:after="0"/>
-            </w:pPr>
-            <w:r/>
-            <w:r>
-              <w:t>Not applicable (State Government officer)</w:t>
-            </w:r>
-          </w:p>
-        </w:tc>
-      </w:tr>
-      <w:tr>
-        <w:tc>
-          <w:tcPr>
-            <w:tcW w:type="dxa" w:w="3312"/>
-            <w:shd w:val="clear" w:color="auto" w:fill="F2F2F2"/>
-          </w:tcPr>
-          <w:p>
-            <w:pPr>
-              <w:spacing w:after="0"/>
-            </w:pPr>
-            <w:r/>
-            <w:r>
-              <w:rPr>
-                <w:b/>
-              </w:rPr>
-              <w:t>Current service status</w:t>
-            </w:r>
-          </w:p>
-        </w:tc>
-        <w:tc>
-          <w:tcPr>
-            <w:tcW w:type="dxa" w:w="5760"/>
-          </w:tcPr>
-          <w:p>
-            <w:pPr>
-              <w:spacing w:after="0"/>
-            </w:pPr>
-            <w:r/>
-            <w:r>
-              <w:t>☐ Probationer   ☒ Confirmed</w:t>
-            </w:r>
-          </w:p>
-        </w:tc>
-      </w:tr>
-      <w:tr>
-        <w:tc>
-          <w:tcPr>
-            <w:tcW w:type="dxa" w:w="3312"/>
-            <w:shd w:val="clear" w:color="auto" w:fill="F2F2F2"/>
-          </w:tcPr>
-          <w:p>
-            <w:pPr>
-              <w:spacing w:after="0"/>
-            </w:pPr>
-            <w:r/>
-            <w:r>
-              <w:rPr>
-                <w:b/>
-              </w:rPr>
-              <w:t>Training Institute / Academy (if currently undergoing institutional training)</w:t>
-            </w:r>
-          </w:p>
-        </w:tc>
-        <w:tc>
-          <w:tcPr>
-            <w:tcW w:type="dxa" w:w="5760"/>
-          </w:tcPr>
-          <w:p>
-            <w:pPr>
-              <w:spacing w:after="0"/>
-            </w:pPr>
-            <w:r/>
-            <w:r>
-              <w:t>Not applicable</w:t>
-            </w:r>
-          </w:p>
-        </w:tc>
-      </w:tr>
-      <w:tr>
-        <w:tc>
-          <w:tcPr>
-            <w:tcW w:type="dxa" w:w="3312"/>
-            <w:shd w:val="clear" w:color="auto" w:fill="F2F2F2"/>
-          </w:tcPr>
-          <w:p>
-            <w:pPr>
-              <w:spacing w:after="0"/>
-            </w:pPr>
-            <w:r/>
-            <w:r>
-              <w:rPr>
-                <w:b/>
-              </w:rPr>
-              <w:t>Current Posting</w:t>
-            </w:r>
-          </w:p>
-        </w:tc>
-        <w:tc>
-          <w:tcPr>
-            <w:tcW w:type="dxa" w:w="5760"/>
-          </w:tcPr>
-          <w:p>
-            <w:pPr>
-              <w:spacing w:after="0"/>
-            </w:pPr>
-            <w:r/>
-            <w:r>
-              <w:t>DSERT, Bengaluru</w:t>
-            </w:r>
-          </w:p>
-        </w:tc>
-      </w:tr>
-    </w:tbl>
-    <w:p>
-      <w:pPr>
-        <w:spacing w:after="120" w:before="160"/>
-      </w:pPr>
-      <w:r>
-        <w:rPr>
-          <w:b/>
-          <w:i w:val="0"/>
-          <w:sz w:val="24"/>
-          <w:u w:val="none"/>
-        </w:rPr>
-        <w:t>Section 2: Feedback for Sixth National Conference of Chief Secretaries</w:t>
-      </w:r>
-    </w:p>
-    <w:p>
-      <w:pPr>
-        <w:spacing w:after="120" w:before="160"/>
-      </w:pPr>
-      <w:r>
-        <w:rPr>
-          <w:b/>
-          <w:i w:val="0"/>
-          <w:sz w:val="24"/>
-          <w:u w:val="none"/>
-        </w:rPr>
-        <w:t>1. Name of the topic</w:t>
-      </w:r>
-    </w:p>
-    <w:p>
-      <w:pPr>
-        <w:spacing w:after="80" w:before="0"/>
-      </w:pPr>
-      <w:r>
-        <w:rPr>
-          <w:b w:val="0"/>
-          <w:i/>
-          <w:sz w:val="20"/>
-          <w:u w:val="none"/>
-        </w:rPr>
-        <w:t>(Choose from the topics of the conference)</w:t>
-      </w:r>
-    </w:p>
-    <w:tbl>
-      <w:tblPr>
-        <w:tblW w:type="auto" w:w="0"/>
-        <w:tblLook w:firstColumn="1" w:firstRow="1" w:lastColumn="0" w:lastRow="0" w:noHBand="0" w:noVBand="1" w:val="04A0"/>
-        <w:tblBorders>
-          <w:top w:val="single" w:sz="6" w:color="000000"/>
-          <w:left w:val="single" w:sz="6" w:color="000000"/>
-          <w:bottom w:val="single" w:sz="6" w:color="000000"/>
-          <w:right w:val="single" w:sz="6" w:color="000000"/>
-          <w:insideH w:val="single" w:sz="6" w:color="000000"/>
-          <w:insideV w:val="single" w:sz="6" w:color="000000"/>
-        </w:tblBorders>
-      </w:tblPr>
-      <w:tblGrid>
-        <w:gridCol w:w="9026"/>
-      </w:tblGrid>
-      <w:tr>
-        <w:tc>
-          <w:tcPr>
-            <w:tcW w:type="dxa" w:w="9026"/>
-          </w:tcPr>
-          <w:p>
-            <w:pPr>
-              <w:spacing w:after="60"/>
-              <w:jc w:val="both"/>
-            </w:pPr>
-            <w:r>
-              <w:rPr>
-                <w:b w:val="0"/>
-              </w:rPr>
-              <w:t>Human Development: Ensure Quality Education</w:t>
-            </w:r>
-          </w:p>
-          <w:p>
-            <w:pPr>
-              <w:spacing w:after="60"/>
-              <w:jc w:val="both"/>
-            </w:pPr>
-            <w:r>
-              <w:rPr>
-                <w:b/>
-              </w:rPr>
-              <w:t xml:space="preserve">Sub-topic: </w:t>
-            </w:r>
-            <w:r>
-              <w:rPr>
-                <w:b/>
-              </w:rPr>
-              <w:t>Shift from Nali Kali (Multigrade) to Monograde Classrooms in Classes 1 to 3</w:t>
-            </w:r>
-          </w:p>
-        </w:tc>
-      </w:tr>
-    </w:tbl>
-    <w:p>
-      <w:pPr>
-        <w:spacing w:after="120" w:before="160"/>
-      </w:pPr>
-      <w:r>
-        <w:rPr>
-          <w:b/>
-          <w:i w:val="0"/>
-          <w:sz w:val="24"/>
-          <w:u w:val="none"/>
-        </w:rPr>
-        <w:t>2. Policy Gaps and Challenges</w:t>
-      </w:r>
-    </w:p>
-    <w:p>
-      <w:pPr>
-        <w:spacing w:after="80" w:before="0"/>
-      </w:pPr>
-      <w:r>
-        <w:rPr>
-          <w:b w:val="0"/>
-          <w:i/>
-          <w:sz w:val="20"/>
-          <w:u w:val="none"/>
-        </w:rPr>
-        <w:t>(Current policy challenges, administrative and implementing challenges with respect to the topic selected)</w:t>
-      </w:r>
-    </w:p>
-    <w:tbl>
-      <w:tblPr>
-        <w:tblW w:type="auto" w:w="0"/>
-        <w:tblLook w:firstColumn="1" w:firstRow="1" w:lastColumn="0" w:lastRow="0" w:noHBand="0" w:noVBand="1" w:val="04A0"/>
-        <w:tblBorders>
-          <w:top w:val="single" w:sz="6" w:color="000000"/>
-          <w:left w:val="single" w:sz="6" w:color="000000"/>
-          <w:bottom w:val="single" w:sz="6" w:color="000000"/>
-          <w:right w:val="single" w:sz="6" w:color="000000"/>
-          <w:insideH w:val="single" w:sz="6" w:color="000000"/>
-          <w:insideV w:val="single" w:sz="6" w:color="000000"/>
-        </w:tblBorders>
-      </w:tblPr>
-      <w:tblGrid>
-        <w:gridCol w:w="9026"/>
-      </w:tblGrid>
-      <w:tr>
-        <w:tc>
-          <w:tcPr>
-            <w:tcW w:type="dxa" w:w="9026"/>
-          </w:tcPr>
-          <w:p>
-            <w:pPr>
-              <w:spacing w:after="60"/>
-              <w:jc w:val="both"/>
-            </w:pPr>
-            <w:r>
-              <w:rPr>
-                <w:b w:val="0"/>
-              </w:rPr>
-              <w:t>Nali Kali was piloted in 1995 in H.D. Kote taluk of Mysuru district with UNICEF support and was extended to all Government schools in 2009. Children of Classes 1 to 3 learnt together in one room through activity-based, self-paced work in small groups.</w:t>
-            </w:r>
-          </w:p>
-          <w:p>
-            <w:pPr>
-              <w:spacing w:after="60"/>
-              <w:jc w:val="both"/>
-            </w:pPr>
-            <w:r>
-              <w:rPr>
-                <w:b w:val="0"/>
-              </w:rPr>
-              <w:t>Over time, concerns were raised about its effect on learning. Officials reported that many children could not form complete sentences, which affected their learning in higher classes. A task force on implementing NEP 2020 recommended a review, and the Karnataka State Primary School Teachers' Association requested discontinuation, linking the combined Classes 1 to 3 to falling enrolment in Government schools. Children also found the jump in academic demand in Class 4 difficult.</w:t>
-            </w:r>
-          </w:p>
-          <w:p>
-            <w:pPr>
-              <w:spacing w:after="60"/>
-              <w:jc w:val="both"/>
-            </w:pPr>
-            <w:r>
-              <w:rPr>
-                <w:b w:val="0"/>
-              </w:rPr>
-              <w:t>In November 2025 the State decided to end Nali Kali and convert its classrooms into single-grade (monograde) classrooms in phases, starting with 29,000 schools, with full discontinuation planned from 2026-27. A change of this size needs careful planning of teachers, rooms, training and monitoring so that children's learning improves without disruption.</w:t>
-            </w:r>
-          </w:p>
-        </w:tc>
-      </w:tr>
-    </w:tbl>
-    <w:p>
-      <w:pPr>
-        <w:spacing w:after="120" w:before="160"/>
-      </w:pPr>
-      <w:r>
-        <w:rPr>
-          <w:b/>
-          <w:i w:val="0"/>
-          <w:sz w:val="24"/>
-          <w:u w:val="none"/>
-        </w:rPr>
-        <w:t>3. Potential Solutions</w:t>
-      </w:r>
-    </w:p>
-    <w:p>
-      <w:pPr>
-        <w:spacing w:after="80" w:before="0"/>
-      </w:pPr>
-      <w:r>
-        <w:rPr>
-          <w:b w:val="0"/>
-          <w:i/>
-          <w:sz w:val="20"/>
-          <w:u w:val="none"/>
-        </w:rPr>
-        <w:t>(Can potentially highlight new technology solutions, scope for convergence with other schemes/ programmes, etc.)</w:t>
-      </w:r>
-    </w:p>
-    <w:tbl>
-      <w:tblPr>
-        <w:tblW w:type="auto" w:w="0"/>
-        <w:tblLook w:firstColumn="1" w:firstRow="1" w:lastColumn="0" w:lastRow="0" w:noHBand="0" w:noVBand="1" w:val="04A0"/>
-        <w:tblBorders>
-          <w:top w:val="single" w:sz="6" w:color="000000"/>
-          <w:left w:val="single" w:sz="6" w:color="000000"/>
-          <w:bottom w:val="single" w:sz="6" w:color="000000"/>
-          <w:right w:val="single" w:sz="6" w:color="000000"/>
-          <w:insideH w:val="single" w:sz="6" w:color="000000"/>
-          <w:insideV w:val="single" w:sz="6" w:color="000000"/>
-        </w:tblBorders>
-      </w:tblPr>
-      <w:tblGrid>
-        <w:gridCol w:w="9026"/>
-      </w:tblGrid>
-      <w:tr>
-        <w:tc>
-          <w:tcPr>
-            <w:tcW w:type="dxa" w:w="9026"/>
-          </w:tcPr>
-          <w:p>
-            <w:pPr>
-              <w:spacing w:after="60"/>
-              <w:ind w:left="360" w:hanging="259"/>
-              <w:jc w:val="both"/>
-            </w:pPr>
-            <w:r>
-              <w:rPr>
-                <w:b w:val="0"/>
-              </w:rPr>
-              <w:t xml:space="preserve">•  </w:t>
-            </w:r>
-            <w:r>
-              <w:rPr>
-                <w:b/>
-              </w:rPr>
-              <w:t xml:space="preserve">Phased transition: </w:t>
-            </w:r>
-            <w:r>
-              <w:rPr>
-                <w:b w:val="0"/>
-              </w:rPr>
-              <w:t>Convert schools to monograde in phases, beginning where teachers and classrooms are already available.</w:t>
-            </w:r>
-          </w:p>
-          <w:p>
-            <w:pPr>
-              <w:spacing w:after="60"/>
-              <w:ind w:left="360" w:hanging="259"/>
-              <w:jc w:val="both"/>
-            </w:pPr>
-            <w:r>
-              <w:rPr>
-                <w:b w:val="0"/>
-              </w:rPr>
-              <w:t xml:space="preserve">•  </w:t>
-            </w:r>
-            <w:r>
-              <w:rPr>
-                <w:b/>
-              </w:rPr>
-              <w:t xml:space="preserve">School-wise readiness list: </w:t>
-            </w:r>
-            <w:r>
-              <w:rPr>
-                <w:b w:val="0"/>
-              </w:rPr>
-              <w:t>Use SATS and UDISE+ data to classify every primary school by grade-wise enrolment, teachers in position, classrooms and furniture.</w:t>
-            </w:r>
-          </w:p>
-          <w:p>
-            <w:pPr>
-              <w:spacing w:after="60"/>
-              <w:ind w:left="360" w:hanging="259"/>
-              <w:jc w:val="both"/>
-            </w:pPr>
-            <w:r>
-              <w:rPr>
-                <w:b w:val="0"/>
-              </w:rPr>
-              <w:t xml:space="preserve">•  </w:t>
-            </w:r>
-            <w:r>
-              <w:rPr>
-                <w:b/>
-              </w:rPr>
-              <w:t xml:space="preserve">Clear Government order and guidelines: </w:t>
-            </w:r>
-            <w:r>
-              <w:rPr>
-                <w:b w:val="0"/>
-              </w:rPr>
-              <w:t>Issue guidelines on timelines, classroom arrangement, timetable, teacher allocation and learning materials for Classes 1 to 3.</w:t>
-            </w:r>
-          </w:p>
-          <w:p>
-            <w:pPr>
-              <w:spacing w:after="60"/>
-              <w:ind w:left="360" w:hanging="259"/>
-              <w:jc w:val="both"/>
-            </w:pPr>
-            <w:r>
-              <w:rPr>
-                <w:b w:val="0"/>
-              </w:rPr>
-              <w:t xml:space="preserve">•  </w:t>
-            </w:r>
-            <w:r>
-              <w:rPr>
-                <w:b/>
-              </w:rPr>
-              <w:t xml:space="preserve">Retain the strengths of activity-based learning: </w:t>
-            </w:r>
-            <w:r>
-              <w:rPr>
-                <w:b w:val="0"/>
-              </w:rPr>
-              <w:t>Continue joyful, child-centred methods within each single-grade class.</w:t>
-            </w:r>
-          </w:p>
-          <w:p>
-            <w:pPr>
-              <w:spacing w:after="60"/>
-              <w:ind w:left="360" w:hanging="259"/>
-              <w:jc w:val="both"/>
-            </w:pPr>
-            <w:r>
-              <w:rPr>
-                <w:b w:val="0"/>
-              </w:rPr>
-              <w:t xml:space="preserve">•  </w:t>
-            </w:r>
-            <w:r>
-              <w:rPr>
-                <w:b/>
-              </w:rPr>
-              <w:t xml:space="preserve">Smooth progression to Class 4: </w:t>
-            </w:r>
-            <w:r>
-              <w:rPr>
-                <w:b w:val="0"/>
-              </w:rPr>
-              <w:t>Align Classes 1 to 3 and Class 4 so that children move up without a sudden jump in difficulty.</w:t>
-            </w:r>
-          </w:p>
-          <w:p>
-            <w:pPr>
-              <w:spacing w:after="60"/>
-              <w:ind w:left="360" w:hanging="259"/>
-              <w:jc w:val="both"/>
-            </w:pPr>
-            <w:r>
-              <w:rPr>
-                <w:b w:val="0"/>
-              </w:rPr>
-              <w:t xml:space="preserve">•  </w:t>
-            </w:r>
-            <w:r>
-              <w:rPr>
-                <w:b/>
-              </w:rPr>
-              <w:t xml:space="preserve">Communication with parents and SDMCs: </w:t>
-            </w:r>
-            <w:r>
-              <w:rPr>
-                <w:b w:val="0"/>
-              </w:rPr>
-              <w:t>Explain the reasons for the change and the expected benefits for children.</w:t>
-            </w:r>
-          </w:p>
-          <w:p>
-            <w:pPr>
-              <w:spacing w:after="60"/>
-              <w:ind w:left="360" w:hanging="259"/>
-              <w:jc w:val="both"/>
-            </w:pPr>
-            <w:r>
-              <w:rPr>
-                <w:b w:val="0"/>
-              </w:rPr>
-              <w:t xml:space="preserve">•  </w:t>
-            </w:r>
-            <w:r>
-              <w:rPr>
-                <w:b/>
-              </w:rPr>
-              <w:t xml:space="preserve">Regular review: </w:t>
-            </w:r>
-            <w:r>
-              <w:rPr>
-                <w:b w:val="0"/>
-              </w:rPr>
-              <w:t>Monitor progress at block, district and State levels every term and resolve problems quickly.</w:t>
-            </w:r>
-          </w:p>
-        </w:tc>
-      </w:tr>
-    </w:tbl>
-    <w:p>
-      <w:pPr>
-        <w:spacing w:after="120" w:before="160"/>
-      </w:pPr>
-      <w:r>
-        <w:rPr>
-          <w:b/>
-          <w:i w:val="0"/>
-          <w:sz w:val="24"/>
-          <w:u w:val="none"/>
-        </w:rPr>
-        <w:t>4. Best Practices</w:t>
-      </w:r>
-    </w:p>
-    <w:p>
-      <w:pPr>
-        <w:spacing w:after="80" w:before="0"/>
-      </w:pPr>
-      <w:r>
-        <w:rPr>
-          <w:b w:val="0"/>
-          <w:i/>
-          <w:sz w:val="20"/>
-          <w:u w:val="none"/>
-        </w:rPr>
-        <w:t>(Highlights the practices, which are sustainable, replicable, scalable, monitorable, etc. Can also highlight the block/district/ State level practices)</w:t>
-      </w:r>
-    </w:p>
-    <w:tbl>
-      <w:tblPr>
-        <w:tblW w:type="auto" w:w="0"/>
-        <w:tblLook w:firstColumn="1" w:firstRow="1" w:lastColumn="0" w:lastRow="0" w:noHBand="0" w:noVBand="1" w:val="04A0"/>
-        <w:tblBorders>
-          <w:top w:val="single" w:sz="6" w:color="000000"/>
-          <w:left w:val="single" w:sz="6" w:color="000000"/>
-          <w:bottom w:val="single" w:sz="6" w:color="000000"/>
-          <w:right w:val="single" w:sz="6" w:color="000000"/>
-          <w:insideH w:val="single" w:sz="6" w:color="000000"/>
-          <w:insideV w:val="single" w:sz="6" w:color="000000"/>
-        </w:tblBorders>
-      </w:tblPr>
-      <w:tblGrid>
-        <w:gridCol w:w="9026"/>
-      </w:tblGrid>
-      <w:tr>
-        <w:tc>
-          <w:tcPr>
-            <w:tcW w:type="dxa" w:w="9026"/>
-          </w:tcPr>
-          <w:p>
-            <w:pPr>
-              <w:spacing w:after="60"/>
-              <w:jc w:val="both"/>
-            </w:pPr>
-            <w:r>
-              <w:rPr>
-                <w:b w:val="0"/>
-              </w:rPr>
-              <w:t>The State has adopted a phased approach to the transition instead of a single-step change. In the first phase, Nali Kali is being withdrawn from 29,000 schools, including bilingual schools, and the classrooms are being converted into single-grade classrooms. Schools moved to monograde bilingual classrooms from 1 June 2026.</w:t>
-            </w:r>
-          </w:p>
-          <w:p>
-            <w:pPr>
-              <w:spacing w:after="60"/>
-              <w:jc w:val="both"/>
-            </w:pPr>
-            <w:r>
-              <w:rPr>
-                <w:b w:val="0"/>
-              </w:rPr>
-              <w:t>The decision was taken after considering the recommendation of the NEP 2020 implementation task force and the views of teachers. The phased approach allows the Department to learn from the first schools, solve problems of teachers, rooms and furniture, and then extend the change to all schools. This is a good example of evidence-based and phased implementation of a major policy change. It can be monitored through school-wise transition status, teacher and room availability and learning outcomes of Classes 1 to 4.</w:t>
-            </w:r>
-          </w:p>
-        </w:tc>
-      </w:tr>
-    </w:tbl>
-    <w:p>
-      <w:pPr>
-        <w:spacing w:after="120" w:before="160"/>
-      </w:pPr>
-      <w:r>
-        <w:rPr>
-          <w:b/>
-          <w:i w:val="0"/>
-          <w:sz w:val="24"/>
-          <w:u w:val="none"/>
-        </w:rPr>
-        <w:t>References</w:t>
-      </w:r>
-    </w:p>
-    <w:p>
-      <w:pPr>
-        <w:spacing w:after="60" w:before="0"/>
-        <w:ind w:left="576" w:hanging="576"/>
-        <w:jc w:val="both"/>
-      </w:pPr>
-      <w:r>
-        <w:rPr>
-          <w:b w:val="0"/>
-          <w:i w:val="0"/>
-          <w:u w:val="none"/>
-        </w:rPr>
-        <w:t>Deccan Herald (4 November 2025); The Federal (19 February 2026); Times of India, via Spill (8 June 2026).</w:t>
-      </w:r>
-    </w:p>
-    <w:p>
-      <w:r>
-        <w:br w:type="page"/>
-      </w:r>
-    </w:p>
-    <w:p>
-      <w:pPr>
-        <w:spacing w:after="120" w:before="0"/>
-        <w:jc w:val="right"/>
-      </w:pPr>
-      <w:r>
-        <w:rPr>
-          <w:b/>
-          <w:i w:val="0"/>
-          <w:u w:val="none"/>
-        </w:rPr>
-        <w:t>Annexure-1</w:t>
-      </w:r>
-    </w:p>
-    <w:p>
-      <w:pPr>
-        <w:spacing w:after="40" w:before="0"/>
-        <w:jc w:val="center"/>
-      </w:pPr>
-      <w:r>
-        <w:rPr>
-          <w:b/>
-          <w:i w:val="0"/>
-          <w:sz w:val="28"/>
-          <w:u w:val="none"/>
-        </w:rPr>
-        <w:t>Feedback Note 2</w:t>
       </w:r>
     </w:p>
     <w:p>
@@ -2274,7 +1361,7 @@
           <w:sz w:val="28"/>
           <w:u w:val="none"/>
         </w:rPr>
-        <w:t>Feedback Note 3</w:t>
+        <w:t>Feedback Note 2</w:t>
       </w:r>
     </w:p>
     <w:p>
@@ -3021,7 +2108,7 @@
           <w:sz w:val="28"/>
           <w:u w:val="none"/>
         </w:rPr>
-        <w:t>Feedback Note 4</w:t>
+        <w:t>Feedback Note 3</w:t>
       </w:r>
     </w:p>
     <w:p>
@@ -3768,754 +2855,7 @@
           <w:sz w:val="28"/>
           <w:u w:val="none"/>
         </w:rPr>
-        <w:t>Feedback Note 5</w:t>
-      </w:r>
-    </w:p>
-    <w:p>
-      <w:pPr>
-        <w:spacing w:after="160" w:before="0"/>
-        <w:jc w:val="center"/>
-      </w:pPr>
-      <w:r>
-        <w:rPr>
-          <w:b w:val="0"/>
-          <w:i/>
-          <w:sz w:val="20"/>
-          <w:u w:val="none"/>
-        </w:rPr>
-        <w:t>(by all IAS officers / State Department Officers / All Probationers of National and State Training Institutes and Academies)</w:t>
-      </w:r>
-    </w:p>
-    <w:p>
-      <w:pPr>
-        <w:spacing w:after="120" w:before="160"/>
-      </w:pPr>
-      <w:r>
-        <w:rPr>
-          <w:b/>
-          <w:i w:val="0"/>
-          <w:sz w:val="24"/>
-          <w:u w:val="none"/>
-        </w:rPr>
-        <w:t>Section 1: Officer Name and Details</w:t>
-      </w:r>
-    </w:p>
-    <w:tbl>
-      <w:tblPr>
-        <w:tblW w:type="auto" w:w="0"/>
-        <w:tblLook w:firstColumn="1" w:firstRow="1" w:lastColumn="0" w:lastRow="0" w:noHBand="0" w:noVBand="1" w:val="04A0"/>
-        <w:tblBorders>
-          <w:top w:val="single" w:sz="4" w:color="000000"/>
-          <w:left w:val="single" w:sz="4" w:color="000000"/>
-          <w:bottom w:val="single" w:sz="4" w:color="000000"/>
-          <w:right w:val="single" w:sz="4" w:color="000000"/>
-          <w:insideH w:val="single" w:sz="4" w:color="000000"/>
-          <w:insideV w:val="single" w:sz="4" w:color="000000"/>
-        </w:tblBorders>
-      </w:tblPr>
-      <w:tblGrid>
-        <w:gridCol w:w="4513"/>
-        <w:gridCol w:w="4513"/>
-      </w:tblGrid>
-      <w:tr>
-        <w:tc>
-          <w:tcPr>
-            <w:tcW w:type="dxa" w:w="3312"/>
-            <w:shd w:val="clear" w:color="auto" w:fill="F2F2F2"/>
-          </w:tcPr>
-          <w:p>
-            <w:pPr>
-              <w:spacing w:after="0"/>
-            </w:pPr>
-            <w:r/>
-            <w:r>
-              <w:rPr>
-                <w:b/>
-              </w:rPr>
-              <w:t>Name</w:t>
-            </w:r>
-          </w:p>
-        </w:tc>
-        <w:tc>
-          <w:tcPr>
-            <w:tcW w:type="dxa" w:w="5760"/>
-          </w:tcPr>
-          <w:p>
-            <w:pPr>
-              <w:spacing w:after="0"/>
-            </w:pPr>
-            <w:r/>
-            <w:r>
-              <w:t>Dr. Padmashree R.P.</w:t>
-            </w:r>
-          </w:p>
-        </w:tc>
-      </w:tr>
-      <w:tr>
-        <w:tc>
-          <w:tcPr>
-            <w:tcW w:type="dxa" w:w="3312"/>
-            <w:shd w:val="clear" w:color="auto" w:fill="F2F2F2"/>
-          </w:tcPr>
-          <w:p>
-            <w:pPr>
-              <w:spacing w:after="0"/>
-            </w:pPr>
-            <w:r/>
-            <w:r>
-              <w:rPr>
-                <w:b/>
-              </w:rPr>
-              <w:t>Designation</w:t>
-            </w:r>
-          </w:p>
-        </w:tc>
-        <w:tc>
-          <w:tcPr>
-            <w:tcW w:type="dxa" w:w="5760"/>
-          </w:tcPr>
-          <w:p>
-            <w:pPr>
-              <w:spacing w:after="0"/>
-            </w:pPr>
-            <w:r/>
-            <w:r>
-              <w:t>Senior Assistant Director, Teacher Education and Research Wing</w:t>
-            </w:r>
-          </w:p>
-        </w:tc>
-      </w:tr>
-      <w:tr>
-        <w:tc>
-          <w:tcPr>
-            <w:tcW w:type="dxa" w:w="3312"/>
-            <w:shd w:val="clear" w:color="auto" w:fill="F2F2F2"/>
-          </w:tcPr>
-          <w:p>
-            <w:pPr>
-              <w:spacing w:after="0"/>
-            </w:pPr>
-            <w:r/>
-            <w:r>
-              <w:rPr>
-                <w:b/>
-              </w:rPr>
-              <w:t>Batch</w:t>
-            </w:r>
-          </w:p>
-        </w:tc>
-        <w:tc>
-          <w:tcPr>
-            <w:tcW w:type="dxa" w:w="5760"/>
-          </w:tcPr>
-          <w:p>
-            <w:pPr>
-              <w:spacing w:after="0"/>
-            </w:pPr>
-            <w:r/>
-            <w:r>
-              <w:t>Not applicable (State Government officer)</w:t>
-            </w:r>
-          </w:p>
-        </w:tc>
-      </w:tr>
-      <w:tr>
-        <w:tc>
-          <w:tcPr>
-            <w:tcW w:type="dxa" w:w="3312"/>
-            <w:shd w:val="clear" w:color="auto" w:fill="F2F2F2"/>
-          </w:tcPr>
-          <w:p>
-            <w:pPr>
-              <w:spacing w:after="0"/>
-            </w:pPr>
-            <w:r/>
-            <w:r>
-              <w:rPr>
-                <w:b/>
-              </w:rPr>
-              <w:t>Current service status</w:t>
-            </w:r>
-          </w:p>
-        </w:tc>
-        <w:tc>
-          <w:tcPr>
-            <w:tcW w:type="dxa" w:w="5760"/>
-          </w:tcPr>
-          <w:p>
-            <w:pPr>
-              <w:spacing w:after="0"/>
-            </w:pPr>
-            <w:r/>
-            <w:r>
-              <w:t>☐ Probationer   ☒ Confirmed</w:t>
-            </w:r>
-          </w:p>
-        </w:tc>
-      </w:tr>
-      <w:tr>
-        <w:tc>
-          <w:tcPr>
-            <w:tcW w:type="dxa" w:w="3312"/>
-            <w:shd w:val="clear" w:color="auto" w:fill="F2F2F2"/>
-          </w:tcPr>
-          <w:p>
-            <w:pPr>
-              <w:spacing w:after="0"/>
-            </w:pPr>
-            <w:r/>
-            <w:r>
-              <w:rPr>
-                <w:b/>
-              </w:rPr>
-              <w:t>Training Institute / Academy (if currently undergoing institutional training)</w:t>
-            </w:r>
-          </w:p>
-        </w:tc>
-        <w:tc>
-          <w:tcPr>
-            <w:tcW w:type="dxa" w:w="5760"/>
-          </w:tcPr>
-          <w:p>
-            <w:pPr>
-              <w:spacing w:after="0"/>
-            </w:pPr>
-            <w:r/>
-            <w:r>
-              <w:t>Not applicable</w:t>
-            </w:r>
-          </w:p>
-        </w:tc>
-      </w:tr>
-      <w:tr>
-        <w:tc>
-          <w:tcPr>
-            <w:tcW w:type="dxa" w:w="3312"/>
-            <w:shd w:val="clear" w:color="auto" w:fill="F2F2F2"/>
-          </w:tcPr>
-          <w:p>
-            <w:pPr>
-              <w:spacing w:after="0"/>
-            </w:pPr>
-            <w:r/>
-            <w:r>
-              <w:rPr>
-                <w:b/>
-              </w:rPr>
-              <w:t>Current Posting</w:t>
-            </w:r>
-          </w:p>
-        </w:tc>
-        <w:tc>
-          <w:tcPr>
-            <w:tcW w:type="dxa" w:w="5760"/>
-          </w:tcPr>
-          <w:p>
-            <w:pPr>
-              <w:spacing w:after="0"/>
-            </w:pPr>
-            <w:r/>
-            <w:r>
-              <w:t>DSERT, Bengaluru</w:t>
-            </w:r>
-          </w:p>
-        </w:tc>
-      </w:tr>
-    </w:tbl>
-    <w:p>
-      <w:pPr>
-        <w:spacing w:after="120" w:before="160"/>
-      </w:pPr>
-      <w:r>
-        <w:rPr>
-          <w:b/>
-          <w:i w:val="0"/>
-          <w:sz w:val="24"/>
-          <w:u w:val="none"/>
-        </w:rPr>
-        <w:t>Section 2: Feedback for Sixth National Conference of Chief Secretaries</w:t>
-      </w:r>
-    </w:p>
-    <w:p>
-      <w:pPr>
-        <w:spacing w:after="120" w:before="160"/>
-      </w:pPr>
-      <w:r>
-        <w:rPr>
-          <w:b/>
-          <w:i w:val="0"/>
-          <w:sz w:val="24"/>
-          <w:u w:val="none"/>
-        </w:rPr>
-        <w:t>1. Name of the topic</w:t>
-      </w:r>
-    </w:p>
-    <w:p>
-      <w:pPr>
-        <w:spacing w:after="80" w:before="0"/>
-      </w:pPr>
-      <w:r>
-        <w:rPr>
-          <w:b w:val="0"/>
-          <w:i/>
-          <w:sz w:val="20"/>
-          <w:u w:val="none"/>
-        </w:rPr>
-        <w:t>(Choose from the topics of the conference)</w:t>
-      </w:r>
-    </w:p>
-    <w:tbl>
-      <w:tblPr>
-        <w:tblW w:type="auto" w:w="0"/>
-        <w:tblLook w:firstColumn="1" w:firstRow="1" w:lastColumn="0" w:lastRow="0" w:noHBand="0" w:noVBand="1" w:val="04A0"/>
-        <w:tblBorders>
-          <w:top w:val="single" w:sz="6" w:color="000000"/>
-          <w:left w:val="single" w:sz="6" w:color="000000"/>
-          <w:bottom w:val="single" w:sz="6" w:color="000000"/>
-          <w:right w:val="single" w:sz="6" w:color="000000"/>
-          <w:insideH w:val="single" w:sz="6" w:color="000000"/>
-          <w:insideV w:val="single" w:sz="6" w:color="000000"/>
-        </w:tblBorders>
-      </w:tblPr>
-      <w:tblGrid>
-        <w:gridCol w:w="9026"/>
-      </w:tblGrid>
-      <w:tr>
-        <w:tc>
-          <w:tcPr>
-            <w:tcW w:type="dxa" w:w="9026"/>
-          </w:tcPr>
-          <w:p>
-            <w:pPr>
-              <w:spacing w:after="60"/>
-              <w:jc w:val="both"/>
-            </w:pPr>
-            <w:r>
-              <w:rPr>
-                <w:b w:val="0"/>
-              </w:rPr>
-              <w:t>Human Development: Ensure Quality Education</w:t>
-            </w:r>
-          </w:p>
-          <w:p>
-            <w:pPr>
-              <w:spacing w:after="60"/>
-              <w:jc w:val="both"/>
-            </w:pPr>
-            <w:r>
-              <w:rPr>
-                <w:b/>
-              </w:rPr>
-              <w:t xml:space="preserve">Sub-topic: </w:t>
-            </w:r>
-            <w:r>
-              <w:rPr>
-                <w:b/>
-              </w:rPr>
-              <w:t>Retaining Activity-Based and Joyful Learning in Monograde Classrooms</w:t>
-            </w:r>
-          </w:p>
-        </w:tc>
-      </w:tr>
-    </w:tbl>
-    <w:p>
-      <w:pPr>
-        <w:spacing w:after="120" w:before="160"/>
-      </w:pPr>
-      <w:r>
-        <w:rPr>
-          <w:b/>
-          <w:i w:val="0"/>
-          <w:sz w:val="24"/>
-          <w:u w:val="none"/>
-        </w:rPr>
-        <w:t>2. Policy Gaps and Challenges</w:t>
-      </w:r>
-    </w:p>
-    <w:p>
-      <w:pPr>
-        <w:spacing w:after="80" w:before="0"/>
-      </w:pPr>
-      <w:r>
-        <w:rPr>
-          <w:b w:val="0"/>
-          <w:i/>
-          <w:sz w:val="20"/>
-          <w:u w:val="none"/>
-        </w:rPr>
-        <w:t>(Current policy challenges, administrative and implementing challenges with respect to the topic selected)</w:t>
-      </w:r>
-    </w:p>
-    <w:tbl>
-      <w:tblPr>
-        <w:tblW w:type="auto" w:w="0"/>
-        <w:tblLook w:firstColumn="1" w:firstRow="1" w:lastColumn="0" w:lastRow="0" w:noHBand="0" w:noVBand="1" w:val="04A0"/>
-        <w:tblBorders>
-          <w:top w:val="single" w:sz="6" w:color="000000"/>
-          <w:left w:val="single" w:sz="6" w:color="000000"/>
-          <w:bottom w:val="single" w:sz="6" w:color="000000"/>
-          <w:right w:val="single" w:sz="6" w:color="000000"/>
-          <w:insideH w:val="single" w:sz="6" w:color="000000"/>
-          <w:insideV w:val="single" w:sz="6" w:color="000000"/>
-        </w:tblBorders>
-      </w:tblPr>
-      <w:tblGrid>
-        <w:gridCol w:w="9026"/>
-      </w:tblGrid>
-      <w:tr>
-        <w:tc>
-          <w:tcPr>
-            <w:tcW w:type="dxa" w:w="9026"/>
-          </w:tcPr>
-          <w:p>
-            <w:pPr>
-              <w:spacing w:after="60"/>
-              <w:jc w:val="both"/>
-            </w:pPr>
-            <w:r>
-              <w:rPr>
-                <w:b w:val="0"/>
-              </w:rPr>
-              <w:t>Nali Kali and English Nali Kali (ENK) brought joyful, activity-based and fear-free learning into the early grades. DIET studies reported that children became more engaged and confident. There is a risk that, while moving to single-grade classes, teachers may return to lecture and textbook-only teaching, losing these strengths.</w:t>
-            </w:r>
-          </w:p>
-          <w:p>
-            <w:pPr>
-              <w:spacing w:after="60"/>
-              <w:jc w:val="both"/>
-            </w:pPr>
-            <w:r>
-              <w:rPr>
-                <w:b w:val="0"/>
-              </w:rPr>
-              <w:t>At the same time, the studies showed weaknesses that must be corrected: inadequate teacher training, shortage of materials, pressure of multigrade classes and a sudden rise in difficulty in Class 4. Defenders of Nali Kali, including a Kannada Development Authority study, pointed to implementation problems such as weak training and inadequate tools rather than the approach itself.</w:t>
-            </w:r>
-          </w:p>
-        </w:tc>
-      </w:tr>
-    </w:tbl>
-    <w:p>
-      <w:pPr>
-        <w:spacing w:after="120" w:before="160"/>
-      </w:pPr>
-      <w:r>
-        <w:rPr>
-          <w:b/>
-          <w:i w:val="0"/>
-          <w:sz w:val="24"/>
-          <w:u w:val="none"/>
-        </w:rPr>
-        <w:t>3. Potential Solutions</w:t>
-      </w:r>
-    </w:p>
-    <w:p>
-      <w:pPr>
-        <w:spacing w:after="80" w:before="0"/>
-      </w:pPr>
-      <w:r>
-        <w:rPr>
-          <w:b w:val="0"/>
-          <w:i/>
-          <w:sz w:val="20"/>
-          <w:u w:val="none"/>
-        </w:rPr>
-        <w:t>(Can potentially highlight new technology solutions, scope for convergence with other schemes/ programmes, etc.)</w:t>
-      </w:r>
-    </w:p>
-    <w:tbl>
-      <w:tblPr>
-        <w:tblW w:type="auto" w:w="0"/>
-        <w:tblLook w:firstColumn="1" w:firstRow="1" w:lastColumn="0" w:lastRow="0" w:noHBand="0" w:noVBand="1" w:val="04A0"/>
-        <w:tblBorders>
-          <w:top w:val="single" w:sz="6" w:color="000000"/>
-          <w:left w:val="single" w:sz="6" w:color="000000"/>
-          <w:bottom w:val="single" w:sz="6" w:color="000000"/>
-          <w:right w:val="single" w:sz="6" w:color="000000"/>
-          <w:insideH w:val="single" w:sz="6" w:color="000000"/>
-          <w:insideV w:val="single" w:sz="6" w:color="000000"/>
-        </w:tblBorders>
-      </w:tblPr>
-      <w:tblGrid>
-        <w:gridCol w:w="9026"/>
-      </w:tblGrid>
-      <w:tr>
-        <w:tc>
-          <w:tcPr>
-            <w:tcW w:type="dxa" w:w="9026"/>
-          </w:tcPr>
-          <w:p>
-            <w:pPr>
-              <w:spacing w:after="60"/>
-              <w:ind w:left="360" w:hanging="259"/>
-              <w:jc w:val="both"/>
-            </w:pPr>
-            <w:r>
-              <w:rPr>
-                <w:b w:val="0"/>
-              </w:rPr>
-              <w:t xml:space="preserve">•  </w:t>
-            </w:r>
-            <w:r>
-              <w:rPr>
-                <w:b w:val="0"/>
-              </w:rPr>
-              <w:t>Keep activity-based, play-based and joyful learning as the core pedagogy in Classes 1 to 3.</w:t>
-            </w:r>
-          </w:p>
-          <w:p>
-            <w:pPr>
-              <w:spacing w:after="60"/>
-              <w:ind w:left="360" w:hanging="259"/>
-              <w:jc w:val="both"/>
-            </w:pPr>
-            <w:r>
-              <w:rPr>
-                <w:b w:val="0"/>
-              </w:rPr>
-              <w:t xml:space="preserve">•  </w:t>
-            </w:r>
-            <w:r>
-              <w:rPr>
-                <w:b w:val="0"/>
-              </w:rPr>
-              <w:t>Use songs, stories, games, group work and Learning Corners within each single-grade class.</w:t>
-            </w:r>
-          </w:p>
-          <w:p>
-            <w:pPr>
-              <w:spacing w:after="60"/>
-              <w:ind w:left="360" w:hanging="259"/>
-              <w:jc w:val="both"/>
-            </w:pPr>
-            <w:r>
-              <w:rPr>
-                <w:b w:val="0"/>
-              </w:rPr>
-              <w:t xml:space="preserve">•  </w:t>
-            </w:r>
-            <w:r>
-              <w:rPr>
-                <w:b w:val="0"/>
-              </w:rPr>
-              <w:t>Continue continuous and comprehensive assessment of each child's progress.</w:t>
-            </w:r>
-          </w:p>
-          <w:p>
-            <w:pPr>
-              <w:spacing w:after="60"/>
-              <w:ind w:left="360" w:hanging="259"/>
-              <w:jc w:val="both"/>
-            </w:pPr>
-            <w:r>
-              <w:rPr>
-                <w:b w:val="0"/>
-              </w:rPr>
-              <w:t xml:space="preserve">•  </w:t>
-            </w:r>
-            <w:r>
-              <w:rPr>
-                <w:b w:val="0"/>
-              </w:rPr>
-              <w:t>Provide grade-specific activity materials and workbooks aligned with learning outcomes.</w:t>
-            </w:r>
-          </w:p>
-          <w:p>
-            <w:pPr>
-              <w:spacing w:after="60"/>
-              <w:ind w:left="360" w:hanging="259"/>
-              <w:jc w:val="both"/>
-            </w:pPr>
-            <w:r>
-              <w:rPr>
-                <w:b w:val="0"/>
-              </w:rPr>
-              <w:t xml:space="preserve">•  </w:t>
-            </w:r>
-            <w:r>
-              <w:rPr>
-                <w:b w:val="0"/>
-              </w:rPr>
-              <w:t>Plan a gradual increase in reading and writing so that children move smoothly into Class 4.</w:t>
-            </w:r>
-          </w:p>
-          <w:p>
-            <w:pPr>
-              <w:spacing w:after="60"/>
-              <w:ind w:left="360" w:hanging="259"/>
-              <w:jc w:val="both"/>
-            </w:pPr>
-            <w:r>
-              <w:rPr>
-                <w:b w:val="0"/>
-              </w:rPr>
-              <w:t xml:space="preserve">•  </w:t>
-            </w:r>
-            <w:r>
-              <w:rPr>
-                <w:b w:val="0"/>
-              </w:rPr>
-              <w:t>Share good classroom practices through cluster meetings and short videos.</w:t>
-            </w:r>
-          </w:p>
-          <w:p>
-            <w:pPr>
-              <w:spacing w:after="60"/>
-              <w:ind w:left="360" w:hanging="259"/>
-              <w:jc w:val="both"/>
-            </w:pPr>
-            <w:r>
-              <w:rPr>
-                <w:b w:val="0"/>
-              </w:rPr>
-              <w:t xml:space="preserve">•  </w:t>
-            </w:r>
-            <w:r>
-              <w:rPr>
-                <w:b w:val="0"/>
-              </w:rPr>
-              <w:t>Include activity-based teaching as an indicator in classroom observation.</w:t>
-            </w:r>
-          </w:p>
-        </w:tc>
-      </w:tr>
-    </w:tbl>
-    <w:p>
-      <w:pPr>
-        <w:spacing w:after="120" w:before="160"/>
-      </w:pPr>
-      <w:r>
-        <w:rPr>
-          <w:b/>
-          <w:i w:val="0"/>
-          <w:sz w:val="24"/>
-          <w:u w:val="none"/>
-        </w:rPr>
-        <w:t>4. Best Practices</w:t>
-      </w:r>
-    </w:p>
-    <w:p>
-      <w:pPr>
-        <w:spacing w:after="80" w:before="0"/>
-      </w:pPr>
-      <w:r>
-        <w:rPr>
-          <w:b w:val="0"/>
-          <w:i/>
-          <w:sz w:val="20"/>
-          <w:u w:val="none"/>
-        </w:rPr>
-        <w:t>(Highlights the practices, which are sustainable, replicable, scalable, monitorable, etc. Can also highlight the block/district/ State level practices)</w:t>
-      </w:r>
-    </w:p>
-    <w:tbl>
-      <w:tblPr>
-        <w:tblW w:type="auto" w:w="0"/>
-        <w:tblLook w:firstColumn="1" w:firstRow="1" w:lastColumn="0" w:lastRow="0" w:noHBand="0" w:noVBand="1" w:val="04A0"/>
-        <w:tblBorders>
-          <w:top w:val="single" w:sz="6" w:color="000000"/>
-          <w:left w:val="single" w:sz="6" w:color="000000"/>
-          <w:bottom w:val="single" w:sz="6" w:color="000000"/>
-          <w:right w:val="single" w:sz="6" w:color="000000"/>
-          <w:insideH w:val="single" w:sz="6" w:color="000000"/>
-          <w:insideV w:val="single" w:sz="6" w:color="000000"/>
-        </w:tblBorders>
-      </w:tblPr>
-      <w:tblGrid>
-        <w:gridCol w:w="9026"/>
-      </w:tblGrid>
-      <w:tr>
-        <w:tc>
-          <w:tcPr>
-            <w:tcW w:type="dxa" w:w="9026"/>
-          </w:tcPr>
-          <w:p>
-            <w:pPr>
-              <w:spacing w:after="60"/>
-              <w:jc w:val="both"/>
-            </w:pPr>
-            <w:r>
-              <w:rPr>
-                <w:b w:val="0"/>
-              </w:rPr>
-              <w:t>DIET studies record the strengths of activity-based learning. In Bengaluru Rural, the English Nali Kali programme led to a sixty-five per cent improvement in speaking confidence, about thirty per cent more vocabulary than traditional methods, and seventy-eight per cent of students enjoying English classes more. In Uttara Kannada, 75 ENK-trained teachers used songs, games, storytelling and group activities, creating a joyful, child-friendly and fear-free environment. In Kodagu, Nali Kali training strengthened child-centred methods, lesson planning and continuous monitoring.</w:t>
-            </w:r>
-          </w:p>
-          <w:p>
-            <w:pPr>
-              <w:spacing w:after="60"/>
-              <w:jc w:val="both"/>
-            </w:pPr>
-            <w:r>
-              <w:rPr>
-                <w:b w:val="0"/>
-              </w:rPr>
-              <w:t>Carrying these methods into single-grade classrooms, with a teacher for each class, keeps the strengths while removing the main constraint of multigrade teaching. This is a good example of building on what worked in an earlier programme. It can be monitored through classroom observation, children's participation and learning outcomes.</w:t>
-            </w:r>
-          </w:p>
-        </w:tc>
-      </w:tr>
-    </w:tbl>
-    <w:p>
-      <w:pPr>
-        <w:spacing w:after="120" w:before="160"/>
-      </w:pPr>
-      <w:r>
-        <w:rPr>
-          <w:b/>
-          <w:i w:val="0"/>
-          <w:sz w:val="24"/>
-          <w:u w:val="none"/>
-        </w:rPr>
-        <w:t>References</w:t>
-      </w:r>
-    </w:p>
-    <w:p>
-      <w:pPr>
-        <w:spacing w:after="60" w:before="0"/>
-        <w:ind w:left="576" w:hanging="576"/>
-        <w:jc w:val="both"/>
-      </w:pPr>
-      <w:r>
-        <w:rPr>
-          <w:b w:val="0"/>
-          <w:i w:val="0"/>
-          <w:u w:val="none"/>
-        </w:rPr>
-        <w:t>Bengaluru Rural (2024-25), English Nali Kali; DIET Uttara Kannada (2025-26), ENK training; DIET Kodagu (2025-26), Nali Kali training; The Federal (19 February 2026).</w:t>
-      </w:r>
-    </w:p>
-    <w:p>
-      <w:r>
-        <w:br w:type="page"/>
-      </w:r>
-    </w:p>
-    <w:p>
-      <w:pPr>
-        <w:spacing w:after="120" w:before="0"/>
-        <w:jc w:val="right"/>
-      </w:pPr>
-      <w:r>
-        <w:rPr>
-          <w:b/>
-          <w:i w:val="0"/>
-          <w:u w:val="none"/>
-        </w:rPr>
-        <w:t>Annexure-1</w:t>
-      </w:r>
-    </w:p>
-    <w:p>
-      <w:pPr>
-        <w:spacing w:after="40" w:before="0"/>
-        <w:jc w:val="center"/>
-      </w:pPr>
-      <w:r>
-        <w:rPr>
-          <w:b/>
-          <w:i w:val="0"/>
-          <w:sz w:val="28"/>
-          <w:u w:val="none"/>
-        </w:rPr>
-        <w:t>Feedback Note 6</w:t>
+        <w:t>Feedback Note 4</w:t>
       </w:r>
     </w:p>
     <w:p>
@@ -5262,7 +3602,7 @@
           <w:sz w:val="28"/>
           <w:u w:val="none"/>
         </w:rPr>
-        <w:t>Feedback Note 7</w:t>
+        <w:t>Feedback Note 5</w:t>
       </w:r>
     </w:p>
     <w:p>
@@ -6009,7 +4349,7 @@
           <w:sz w:val="28"/>
           <w:u w:val="none"/>
         </w:rPr>
-        <w:t>Feedback Note 8</w:t>
+        <w:t>Feedback Note 6</w:t>
       </w:r>
     </w:p>
     <w:p>
@@ -6787,7 +5127,7 @@
           <w:sz w:val="28"/>
           <w:u w:val="none"/>
         </w:rPr>
-        <w:t>Feedback Note 9</w:t>
+        <w:t>Feedback Note 7</w:t>
       </w:r>
     </w:p>
     <w:p>

</xml_diff>

<commit_message>
Remove remaining Nali Kali-related notes from monograde Annexure-1 document
Co-Authored-By: Claude Opus 5.5 <noreply@anthropic.com>
Claude-Session: https://claude.ai/code/session_01TmoA8EnDu8b3BBjWmeLWrr
</commit_message>
<xml_diff>
--- a/rewrites/cs-conference-feedback/Monograde_Education_Feedback_Notes_Annexure1.docx
+++ b/rewrites/cs-conference-feedback/Monograde_Education_Feedback_Notes_Annexure1.docx
@@ -336,7 +336,7 @@
               <w:rPr>
                 <w:sz w:val="20"/>
               </w:rPr>
-              <w:t>Teacher Preparation for Monograde Teaching</w:t>
+              <w:t>Small Schools and Single-Teacher Schools in the Monograde System</w:t>
             </w:r>
           </w:p>
         </w:tc>
@@ -392,7 +392,7 @@
               <w:rPr>
                 <w:sz w:val="20"/>
               </w:rPr>
-              <w:t>Small Schools and Single-Teacher Schools in the Monograde System</w:t>
+              <w:t>Monitoring Foundational Literacy and Numeracy during the Transition</w:t>
             </w:r>
           </w:p>
         </w:tc>
@@ -448,62 +448,6 @@
               <w:rPr>
                 <w:sz w:val="20"/>
               </w:rPr>
-              <w:t>Monitoring Foundational Literacy and Numeracy during the Transition</w:t>
-            </w:r>
-          </w:p>
-        </w:tc>
-        <w:tc>
-          <w:tcPr>
-            <w:tcW w:type="dxa" w:w="2736"/>
-          </w:tcPr>
-          <w:p>
-            <w:pPr>
-              <w:spacing w:after="0"/>
-            </w:pPr>
-            <w:r/>
-            <w:r>
-              <w:rPr>
-                <w:sz w:val="20"/>
-              </w:rPr>
-              <w:t>DSERT, Bengaluru</w:t>
-            </w:r>
-          </w:p>
-        </w:tc>
-      </w:tr>
-      <w:tr>
-        <w:trPr>
-          <w:cantSplit/>
-        </w:trPr>
-        <w:tc>
-          <w:tcPr>
-            <w:tcW w:type="dxa" w:w="720"/>
-          </w:tcPr>
-          <w:p>
-            <w:pPr>
-              <w:spacing w:after="0"/>
-            </w:pPr>
-            <w:r/>
-            <w:r>
-              <w:rPr>
-                <w:sz w:val="20"/>
-              </w:rPr>
-              <w:t>6</w:t>
-            </w:r>
-          </w:p>
-        </w:tc>
-        <w:tc>
-          <w:tcPr>
-            <w:tcW w:type="dxa" w:w="5616"/>
-          </w:tcPr>
-          <w:p>
-            <w:pPr>
-              <w:spacing w:after="0"/>
-            </w:pPr>
-            <w:r/>
-            <w:r>
-              <w:rPr>
-                <w:sz w:val="20"/>
-              </w:rPr>
               <w:t>Monograde Education: Classroom Visits by BRPs, CRPs and DIET Faculty; Feedback to Teachers; Data and Reporting Requirements; Escalation and Resolution of Problems</w:t>
             </w:r>
           </w:p>
@@ -522,62 +466,6 @@
                 <w:sz w:val="20"/>
               </w:rPr>
               <w:t>DIET, Tumakuru</w:t>
-            </w:r>
-          </w:p>
-        </w:tc>
-      </w:tr>
-      <w:tr>
-        <w:trPr>
-          <w:cantSplit/>
-        </w:trPr>
-        <w:tc>
-          <w:tcPr>
-            <w:tcW w:type="dxa" w:w="720"/>
-          </w:tcPr>
-          <w:p>
-            <w:pPr>
-              <w:spacing w:after="0"/>
-            </w:pPr>
-            <w:r/>
-            <w:r>
-              <w:rPr>
-                <w:sz w:val="20"/>
-              </w:rPr>
-              <w:t>7</w:t>
-            </w:r>
-          </w:p>
-        </w:tc>
-        <w:tc>
-          <w:tcPr>
-            <w:tcW w:type="dxa" w:w="5616"/>
-          </w:tcPr>
-          <w:p>
-            <w:pPr>
-              <w:spacing w:after="0"/>
-            </w:pPr>
-            <w:r/>
-            <w:r>
-              <w:rPr>
-                <w:sz w:val="20"/>
-              </w:rPr>
-              <w:t>Research on the Monograde Transition</w:t>
-            </w:r>
-          </w:p>
-        </w:tc>
-        <w:tc>
-          <w:tcPr>
-            <w:tcW w:type="dxa" w:w="2736"/>
-          </w:tcPr>
-          <w:p>
-            <w:pPr>
-              <w:spacing w:after="0"/>
-            </w:pPr>
-            <w:r/>
-            <w:r>
-              <w:rPr>
-                <w:sz w:val="20"/>
-              </w:rPr>
-              <w:t>DSERT, Bengaluru</w:t>
             </w:r>
           </w:p>
         </w:tc>
@@ -2452,753 +2340,6 @@
               <w:rPr>
                 <w:b/>
               </w:rPr>
-              <w:t>Teacher Preparation for Monograde Teaching</w:t>
-            </w:r>
-          </w:p>
-        </w:tc>
-      </w:tr>
-    </w:tbl>
-    <w:p>
-      <w:pPr>
-        <w:spacing w:after="120" w:before="160"/>
-      </w:pPr>
-      <w:r>
-        <w:rPr>
-          <w:b/>
-          <w:i w:val="0"/>
-          <w:sz w:val="24"/>
-          <w:u w:val="none"/>
-        </w:rPr>
-        <w:t>2. Policy Gaps and Challenges</w:t>
-      </w:r>
-    </w:p>
-    <w:p>
-      <w:pPr>
-        <w:spacing w:after="80" w:before="0"/>
-      </w:pPr>
-      <w:r>
-        <w:rPr>
-          <w:b w:val="0"/>
-          <w:i/>
-          <w:sz w:val="20"/>
-          <w:u w:val="none"/>
-        </w:rPr>
-        <w:t>(Current policy challenges, administrative and implementing challenges with respect to the topic selected)</w:t>
-      </w:r>
-    </w:p>
-    <w:tbl>
-      <w:tblPr>
-        <w:tblW w:type="auto" w:w="0"/>
-        <w:tblLook w:firstColumn="1" w:firstRow="1" w:lastColumn="0" w:lastRow="0" w:noHBand="0" w:noVBand="1" w:val="04A0"/>
-        <w:tblBorders>
-          <w:top w:val="single" w:sz="6" w:color="000000"/>
-          <w:left w:val="single" w:sz="6" w:color="000000"/>
-          <w:bottom w:val="single" w:sz="6" w:color="000000"/>
-          <w:right w:val="single" w:sz="6" w:color="000000"/>
-          <w:insideH w:val="single" w:sz="6" w:color="000000"/>
-          <w:insideV w:val="single" w:sz="6" w:color="000000"/>
-        </w:tblBorders>
-      </w:tblPr>
-      <w:tblGrid>
-        <w:gridCol w:w="9026"/>
-      </w:tblGrid>
-      <w:tr>
-        <w:tc>
-          <w:tcPr>
-            <w:tcW w:type="dxa" w:w="9026"/>
-          </w:tcPr>
-          <w:p>
-            <w:pPr>
-              <w:spacing w:after="60"/>
-              <w:jc w:val="both"/>
-            </w:pPr>
-            <w:r>
-              <w:rPr>
-                <w:b w:val="0"/>
-              </w:rPr>
-              <w:t>For nearly two decades, primary teachers were trained to teach Classes 1 to 3 together using group-based, multi-level methods. Monograde teaching needs different skills: grade-specific lesson planning, greater subject depth, whole-class and group teaching within one grade, and differentiated support for children at different levels in the same class.</w:t>
-            </w:r>
-          </w:p>
-          <w:p>
-            <w:pPr>
-              <w:spacing w:after="60"/>
-              <w:jc w:val="both"/>
-            </w:pPr>
-            <w:r>
-              <w:rPr>
-                <w:b w:val="0"/>
-              </w:rPr>
-              <w:t>DIET studies show that training is the key to good implementation. In Bengaluru Rural, only fifty-five per cent of teachers felt adequately trained for the English Nali Kali method. DIET Chamarajanagar found that trained teachers used activity-based methods and continuous assessment more confidently, but some teachers saw academic monitoring as inspection. The 2026-27 DIET Chitradurga study on the challenges faced by teachers in monograde classes of Classes 1 to 5 shows that this is already a concern in the field.</w:t>
-            </w:r>
-          </w:p>
-        </w:tc>
-      </w:tr>
-    </w:tbl>
-    <w:p>
-      <w:pPr>
-        <w:spacing w:after="120" w:before="160"/>
-      </w:pPr>
-      <w:r>
-        <w:rPr>
-          <w:b/>
-          <w:i w:val="0"/>
-          <w:sz w:val="24"/>
-          <w:u w:val="none"/>
-        </w:rPr>
-        <w:t>3. Potential Solutions</w:t>
-      </w:r>
-    </w:p>
-    <w:p>
-      <w:pPr>
-        <w:spacing w:after="80" w:before="0"/>
-      </w:pPr>
-      <w:r>
-        <w:rPr>
-          <w:b w:val="0"/>
-          <w:i/>
-          <w:sz w:val="20"/>
-          <w:u w:val="none"/>
-        </w:rPr>
-        <w:t>(Can potentially highlight new technology solutions, scope for convergence with other schemes/ programmes, etc.)</w:t>
-      </w:r>
-    </w:p>
-    <w:tbl>
-      <w:tblPr>
-        <w:tblW w:type="auto" w:w="0"/>
-        <w:tblLook w:firstColumn="1" w:firstRow="1" w:lastColumn="0" w:lastRow="0" w:noHBand="0" w:noVBand="1" w:val="04A0"/>
-        <w:tblBorders>
-          <w:top w:val="single" w:sz="6" w:color="000000"/>
-          <w:left w:val="single" w:sz="6" w:color="000000"/>
-          <w:bottom w:val="single" w:sz="6" w:color="000000"/>
-          <w:right w:val="single" w:sz="6" w:color="000000"/>
-          <w:insideH w:val="single" w:sz="6" w:color="000000"/>
-          <w:insideV w:val="single" w:sz="6" w:color="000000"/>
-        </w:tblBorders>
-      </w:tblPr>
-      <w:tblGrid>
-        <w:gridCol w:w="9026"/>
-      </w:tblGrid>
-      <w:tr>
-        <w:tc>
-          <w:tcPr>
-            <w:tcW w:type="dxa" w:w="9026"/>
-          </w:tcPr>
-          <w:p>
-            <w:pPr>
-              <w:spacing w:after="60"/>
-              <w:ind w:left="360" w:hanging="259"/>
-              <w:jc w:val="both"/>
-            </w:pPr>
-            <w:r>
-              <w:rPr>
-                <w:b w:val="0"/>
-              </w:rPr>
-              <w:t xml:space="preserve">•  </w:t>
-            </w:r>
-            <w:r>
-              <w:rPr>
-                <w:b w:val="0"/>
-              </w:rPr>
-              <w:t>Develop DIET training modules on grade-specific lesson planning and competency-based teaching for Classes 1 to 5.</w:t>
-            </w:r>
-          </w:p>
-          <w:p>
-            <w:pPr>
-              <w:spacing w:after="60"/>
-              <w:ind w:left="360" w:hanging="259"/>
-              <w:jc w:val="both"/>
-            </w:pPr>
-            <w:r>
-              <w:rPr>
-                <w:b w:val="0"/>
-              </w:rPr>
-              <w:t xml:space="preserve">•  </w:t>
-            </w:r>
-            <w:r>
-              <w:rPr>
-                <w:b w:val="0"/>
-              </w:rPr>
-              <w:t>Train teachers in differentiated instruction and remedial grouping within one grade.</w:t>
-            </w:r>
-          </w:p>
-          <w:p>
-            <w:pPr>
-              <w:spacing w:after="60"/>
-              <w:ind w:left="360" w:hanging="259"/>
-              <w:jc w:val="both"/>
-            </w:pPr>
-            <w:r>
-              <w:rPr>
-                <w:b w:val="0"/>
-              </w:rPr>
-              <w:t xml:space="preserve">•  </w:t>
-            </w:r>
-            <w:r>
-              <w:rPr>
-                <w:b w:val="0"/>
-              </w:rPr>
-              <w:t>Train all primary teachers, including newly appointed and guest teachers, before and during the transition.</w:t>
-            </w:r>
-          </w:p>
-          <w:p>
-            <w:pPr>
-              <w:spacing w:after="60"/>
-              <w:ind w:left="360" w:hanging="259"/>
-              <w:jc w:val="both"/>
-            </w:pPr>
-            <w:r>
-              <w:rPr>
-                <w:b w:val="0"/>
-              </w:rPr>
-              <w:t xml:space="preserve">•  </w:t>
-            </w:r>
-            <w:r>
-              <w:rPr>
-                <w:b w:val="0"/>
-              </w:rPr>
-              <w:t>Provide practice-based refresher training, workshops and experience-sharing meetings at cluster level.</w:t>
-            </w:r>
-          </w:p>
-          <w:p>
-            <w:pPr>
-              <w:spacing w:after="60"/>
-              <w:ind w:left="360" w:hanging="259"/>
-              <w:jc w:val="both"/>
-            </w:pPr>
-            <w:r>
-              <w:rPr>
-                <w:b w:val="0"/>
-              </w:rPr>
-              <w:t xml:space="preserve">•  </w:t>
-            </w:r>
-            <w:r>
-              <w:rPr>
-                <w:b w:val="0"/>
-              </w:rPr>
-              <w:t>Use DIKSHA and other digital resources for short, self-paced teacher learning modules.</w:t>
-            </w:r>
-          </w:p>
-          <w:p>
-            <w:pPr>
-              <w:spacing w:after="60"/>
-              <w:ind w:left="360" w:hanging="259"/>
-              <w:jc w:val="both"/>
-            </w:pPr>
-            <w:r>
-              <w:rPr>
-                <w:b w:val="0"/>
-              </w:rPr>
-              <w:t xml:space="preserve">•  </w:t>
-            </w:r>
-            <w:r>
-              <w:rPr>
-                <w:b w:val="0"/>
-              </w:rPr>
-              <w:t>Make CRP and BRP visits supportive and mentoring-oriented rather than inspection-oriented.</w:t>
-            </w:r>
-          </w:p>
-          <w:p>
-            <w:pPr>
-              <w:spacing w:after="60"/>
-              <w:ind w:left="360" w:hanging="259"/>
-              <w:jc w:val="both"/>
-            </w:pPr>
-            <w:r>
-              <w:rPr>
-                <w:b w:val="0"/>
-              </w:rPr>
-              <w:t xml:space="preserve">•  </w:t>
-            </w:r>
-            <w:r>
-              <w:rPr>
-                <w:b w:val="0"/>
-              </w:rPr>
-              <w:t>Continue training support for teachers in small schools that must manage more than one class for some time.</w:t>
-            </w:r>
-          </w:p>
-        </w:tc>
-      </w:tr>
-    </w:tbl>
-    <w:p>
-      <w:pPr>
-        <w:spacing w:after="120" w:before="160"/>
-      </w:pPr>
-      <w:r>
-        <w:rPr>
-          <w:b/>
-          <w:i w:val="0"/>
-          <w:sz w:val="24"/>
-          <w:u w:val="none"/>
-        </w:rPr>
-        <w:t>4. Best Practices</w:t>
-      </w:r>
-    </w:p>
-    <w:p>
-      <w:pPr>
-        <w:spacing w:after="80" w:before="0"/>
-      </w:pPr>
-      <w:r>
-        <w:rPr>
-          <w:b w:val="0"/>
-          <w:i/>
-          <w:sz w:val="20"/>
-          <w:u w:val="none"/>
-        </w:rPr>
-        <w:t>(Highlights the practices, which are sustainable, replicable, scalable, monitorable, etc. Can also highlight the block/district/ State level practices)</w:t>
-      </w:r>
-    </w:p>
-    <w:tbl>
-      <w:tblPr>
-        <w:tblW w:type="auto" w:w="0"/>
-        <w:tblLook w:firstColumn="1" w:firstRow="1" w:lastColumn="0" w:lastRow="0" w:noHBand="0" w:noVBand="1" w:val="04A0"/>
-        <w:tblBorders>
-          <w:top w:val="single" w:sz="6" w:color="000000"/>
-          <w:left w:val="single" w:sz="6" w:color="000000"/>
-          <w:bottom w:val="single" w:sz="6" w:color="000000"/>
-          <w:right w:val="single" w:sz="6" w:color="000000"/>
-          <w:insideH w:val="single" w:sz="6" w:color="000000"/>
-          <w:insideV w:val="single" w:sz="6" w:color="000000"/>
-        </w:tblBorders>
-      </w:tblPr>
-      <w:tblGrid>
-        <w:gridCol w:w="9026"/>
-      </w:tblGrid>
-      <w:tr>
-        <w:tc>
-          <w:tcPr>
-            <w:tcW w:type="dxa" w:w="9026"/>
-          </w:tcPr>
-          <w:p>
-            <w:pPr>
-              <w:spacing w:after="60"/>
-              <w:jc w:val="both"/>
-            </w:pPr>
-            <w:r>
-              <w:rPr>
-                <w:b w:val="0"/>
-              </w:rPr>
-              <w:t>DIET Chamarajanagar's study found that ninety-six per cent of head teachers and ninety-seven per cent of teachers had received FLN training, and that trained teachers followed activity-based, child-centred methods and continuous assessment more confidently. Learning Corners were used effectively in ninety-two per cent of schools, and varied teaching methods in ninety-four per cent. Good practices included supportive academic monitoring by head teachers, CRPs and BRPs.</w:t>
-            </w:r>
-          </w:p>
-          <w:p>
-            <w:pPr>
-              <w:spacing w:after="60"/>
-              <w:jc w:val="both"/>
-            </w:pPr>
-            <w:r>
-              <w:rPr>
-                <w:b w:val="0"/>
-              </w:rPr>
-              <w:t>This shows that large-scale teacher training through DIETs and cluster structures can reach almost every teacher. The same system can be used to prepare teachers for monograde classrooms. This is a good example of using the existing DIET-BRC-CRC network for timely capacity building. It can be monitored through training coverage, classroom observation of grade-specific teaching and teachers' feedback.</w:t>
-            </w:r>
-          </w:p>
-        </w:tc>
-      </w:tr>
-    </w:tbl>
-    <w:p>
-      <w:pPr>
-        <w:spacing w:after="120" w:before="160"/>
-      </w:pPr>
-      <w:r>
-        <w:rPr>
-          <w:b/>
-          <w:i w:val="0"/>
-          <w:sz w:val="24"/>
-          <w:u w:val="none"/>
-        </w:rPr>
-        <w:t>References</w:t>
-      </w:r>
-    </w:p>
-    <w:p>
-      <w:pPr>
-        <w:spacing w:after="60" w:before="0"/>
-        <w:ind w:left="576" w:hanging="576"/>
-        <w:jc w:val="both"/>
-      </w:pPr>
-      <w:r>
-        <w:rPr>
-          <w:b w:val="0"/>
-          <w:i w:val="0"/>
-          <w:u w:val="none"/>
-        </w:rPr>
-        <w:t>DIET Chamarajanagar (2025-26); Bengaluru Rural English Nali Kali study (2024-25); DSERT Research Studies Tracker 2026-27 (DIET Chitradurga study).</w:t>
-      </w:r>
-    </w:p>
-    <w:p>
-      <w:r>
-        <w:br w:type="page"/>
-      </w:r>
-    </w:p>
-    <w:p>
-      <w:pPr>
-        <w:spacing w:after="120" w:before="0"/>
-        <w:jc w:val="right"/>
-      </w:pPr>
-      <w:r>
-        <w:rPr>
-          <w:b/>
-          <w:i w:val="0"/>
-          <w:u w:val="none"/>
-        </w:rPr>
-        <w:t>Annexure-1</w:t>
-      </w:r>
-    </w:p>
-    <w:p>
-      <w:pPr>
-        <w:spacing w:after="40" w:before="0"/>
-        <w:jc w:val="center"/>
-      </w:pPr>
-      <w:r>
-        <w:rPr>
-          <w:b/>
-          <w:i w:val="0"/>
-          <w:sz w:val="28"/>
-          <w:u w:val="none"/>
-        </w:rPr>
-        <w:t>Feedback Note 4</w:t>
-      </w:r>
-    </w:p>
-    <w:p>
-      <w:pPr>
-        <w:spacing w:after="160" w:before="0"/>
-        <w:jc w:val="center"/>
-      </w:pPr>
-      <w:r>
-        <w:rPr>
-          <w:b w:val="0"/>
-          <w:i/>
-          <w:sz w:val="20"/>
-          <w:u w:val="none"/>
-        </w:rPr>
-        <w:t>(by all IAS officers / State Department Officers / All Probationers of National and State Training Institutes and Academies)</w:t>
-      </w:r>
-    </w:p>
-    <w:p>
-      <w:pPr>
-        <w:spacing w:after="120" w:before="160"/>
-      </w:pPr>
-      <w:r>
-        <w:rPr>
-          <w:b/>
-          <w:i w:val="0"/>
-          <w:sz w:val="24"/>
-          <w:u w:val="none"/>
-        </w:rPr>
-        <w:t>Section 1: Officer Name and Details</w:t>
-      </w:r>
-    </w:p>
-    <w:tbl>
-      <w:tblPr>
-        <w:tblW w:type="auto" w:w="0"/>
-        <w:tblLook w:firstColumn="1" w:firstRow="1" w:lastColumn="0" w:lastRow="0" w:noHBand="0" w:noVBand="1" w:val="04A0"/>
-        <w:tblBorders>
-          <w:top w:val="single" w:sz="4" w:color="000000"/>
-          <w:left w:val="single" w:sz="4" w:color="000000"/>
-          <w:bottom w:val="single" w:sz="4" w:color="000000"/>
-          <w:right w:val="single" w:sz="4" w:color="000000"/>
-          <w:insideH w:val="single" w:sz="4" w:color="000000"/>
-          <w:insideV w:val="single" w:sz="4" w:color="000000"/>
-        </w:tblBorders>
-      </w:tblPr>
-      <w:tblGrid>
-        <w:gridCol w:w="4513"/>
-        <w:gridCol w:w="4513"/>
-      </w:tblGrid>
-      <w:tr>
-        <w:tc>
-          <w:tcPr>
-            <w:tcW w:type="dxa" w:w="3312"/>
-            <w:shd w:val="clear" w:color="auto" w:fill="F2F2F2"/>
-          </w:tcPr>
-          <w:p>
-            <w:pPr>
-              <w:spacing w:after="0"/>
-            </w:pPr>
-            <w:r/>
-            <w:r>
-              <w:rPr>
-                <w:b/>
-              </w:rPr>
-              <w:t>Name</w:t>
-            </w:r>
-          </w:p>
-        </w:tc>
-        <w:tc>
-          <w:tcPr>
-            <w:tcW w:type="dxa" w:w="5760"/>
-          </w:tcPr>
-          <w:p>
-            <w:pPr>
-              <w:spacing w:after="0"/>
-            </w:pPr>
-            <w:r/>
-            <w:r>
-              <w:t>Dr. Padmashree R.P.</w:t>
-            </w:r>
-          </w:p>
-        </w:tc>
-      </w:tr>
-      <w:tr>
-        <w:tc>
-          <w:tcPr>
-            <w:tcW w:type="dxa" w:w="3312"/>
-            <w:shd w:val="clear" w:color="auto" w:fill="F2F2F2"/>
-          </w:tcPr>
-          <w:p>
-            <w:pPr>
-              <w:spacing w:after="0"/>
-            </w:pPr>
-            <w:r/>
-            <w:r>
-              <w:rPr>
-                <w:b/>
-              </w:rPr>
-              <w:t>Designation</w:t>
-            </w:r>
-          </w:p>
-        </w:tc>
-        <w:tc>
-          <w:tcPr>
-            <w:tcW w:type="dxa" w:w="5760"/>
-          </w:tcPr>
-          <w:p>
-            <w:pPr>
-              <w:spacing w:after="0"/>
-            </w:pPr>
-            <w:r/>
-            <w:r>
-              <w:t>Senior Assistant Director, Teacher Education and Research Wing</w:t>
-            </w:r>
-          </w:p>
-        </w:tc>
-      </w:tr>
-      <w:tr>
-        <w:tc>
-          <w:tcPr>
-            <w:tcW w:type="dxa" w:w="3312"/>
-            <w:shd w:val="clear" w:color="auto" w:fill="F2F2F2"/>
-          </w:tcPr>
-          <w:p>
-            <w:pPr>
-              <w:spacing w:after="0"/>
-            </w:pPr>
-            <w:r/>
-            <w:r>
-              <w:rPr>
-                <w:b/>
-              </w:rPr>
-              <w:t>Batch</w:t>
-            </w:r>
-          </w:p>
-        </w:tc>
-        <w:tc>
-          <w:tcPr>
-            <w:tcW w:type="dxa" w:w="5760"/>
-          </w:tcPr>
-          <w:p>
-            <w:pPr>
-              <w:spacing w:after="0"/>
-            </w:pPr>
-            <w:r/>
-            <w:r>
-              <w:t>Not applicable (State Government officer)</w:t>
-            </w:r>
-          </w:p>
-        </w:tc>
-      </w:tr>
-      <w:tr>
-        <w:tc>
-          <w:tcPr>
-            <w:tcW w:type="dxa" w:w="3312"/>
-            <w:shd w:val="clear" w:color="auto" w:fill="F2F2F2"/>
-          </w:tcPr>
-          <w:p>
-            <w:pPr>
-              <w:spacing w:after="0"/>
-            </w:pPr>
-            <w:r/>
-            <w:r>
-              <w:rPr>
-                <w:b/>
-              </w:rPr>
-              <w:t>Current service status</w:t>
-            </w:r>
-          </w:p>
-        </w:tc>
-        <w:tc>
-          <w:tcPr>
-            <w:tcW w:type="dxa" w:w="5760"/>
-          </w:tcPr>
-          <w:p>
-            <w:pPr>
-              <w:spacing w:after="0"/>
-            </w:pPr>
-            <w:r/>
-            <w:r>
-              <w:t>☐ Probationer   ☒ Confirmed</w:t>
-            </w:r>
-          </w:p>
-        </w:tc>
-      </w:tr>
-      <w:tr>
-        <w:tc>
-          <w:tcPr>
-            <w:tcW w:type="dxa" w:w="3312"/>
-            <w:shd w:val="clear" w:color="auto" w:fill="F2F2F2"/>
-          </w:tcPr>
-          <w:p>
-            <w:pPr>
-              <w:spacing w:after="0"/>
-            </w:pPr>
-            <w:r/>
-            <w:r>
-              <w:rPr>
-                <w:b/>
-              </w:rPr>
-              <w:t>Training Institute / Academy (if currently undergoing institutional training)</w:t>
-            </w:r>
-          </w:p>
-        </w:tc>
-        <w:tc>
-          <w:tcPr>
-            <w:tcW w:type="dxa" w:w="5760"/>
-          </w:tcPr>
-          <w:p>
-            <w:pPr>
-              <w:spacing w:after="0"/>
-            </w:pPr>
-            <w:r/>
-            <w:r>
-              <w:t>Not applicable</w:t>
-            </w:r>
-          </w:p>
-        </w:tc>
-      </w:tr>
-      <w:tr>
-        <w:tc>
-          <w:tcPr>
-            <w:tcW w:type="dxa" w:w="3312"/>
-            <w:shd w:val="clear" w:color="auto" w:fill="F2F2F2"/>
-          </w:tcPr>
-          <w:p>
-            <w:pPr>
-              <w:spacing w:after="0"/>
-            </w:pPr>
-            <w:r/>
-            <w:r>
-              <w:rPr>
-                <w:b/>
-              </w:rPr>
-              <w:t>Current Posting</w:t>
-            </w:r>
-          </w:p>
-        </w:tc>
-        <w:tc>
-          <w:tcPr>
-            <w:tcW w:type="dxa" w:w="5760"/>
-          </w:tcPr>
-          <w:p>
-            <w:pPr>
-              <w:spacing w:after="0"/>
-            </w:pPr>
-            <w:r/>
-            <w:r>
-              <w:t>DSERT, Bengaluru</w:t>
-            </w:r>
-          </w:p>
-        </w:tc>
-      </w:tr>
-    </w:tbl>
-    <w:p>
-      <w:pPr>
-        <w:spacing w:after="120" w:before="160"/>
-      </w:pPr>
-      <w:r>
-        <w:rPr>
-          <w:b/>
-          <w:i w:val="0"/>
-          <w:sz w:val="24"/>
-          <w:u w:val="none"/>
-        </w:rPr>
-        <w:t>Section 2: Feedback for Sixth National Conference of Chief Secretaries</w:t>
-      </w:r>
-    </w:p>
-    <w:p>
-      <w:pPr>
-        <w:spacing w:after="120" w:before="160"/>
-      </w:pPr>
-      <w:r>
-        <w:rPr>
-          <w:b/>
-          <w:i w:val="0"/>
-          <w:sz w:val="24"/>
-          <w:u w:val="none"/>
-        </w:rPr>
-        <w:t>1. Name of the topic</w:t>
-      </w:r>
-    </w:p>
-    <w:p>
-      <w:pPr>
-        <w:spacing w:after="80" w:before="0"/>
-      </w:pPr>
-      <w:r>
-        <w:rPr>
-          <w:b w:val="0"/>
-          <w:i/>
-          <w:sz w:val="20"/>
-          <w:u w:val="none"/>
-        </w:rPr>
-        <w:t>(Choose from the topics of the conference)</w:t>
-      </w:r>
-    </w:p>
-    <w:tbl>
-      <w:tblPr>
-        <w:tblW w:type="auto" w:w="0"/>
-        <w:tblLook w:firstColumn="1" w:firstRow="1" w:lastColumn="0" w:lastRow="0" w:noHBand="0" w:noVBand="1" w:val="04A0"/>
-        <w:tblBorders>
-          <w:top w:val="single" w:sz="6" w:color="000000"/>
-          <w:left w:val="single" w:sz="6" w:color="000000"/>
-          <w:bottom w:val="single" w:sz="6" w:color="000000"/>
-          <w:right w:val="single" w:sz="6" w:color="000000"/>
-          <w:insideH w:val="single" w:sz="6" w:color="000000"/>
-          <w:insideV w:val="single" w:sz="6" w:color="000000"/>
-        </w:tblBorders>
-      </w:tblPr>
-      <w:tblGrid>
-        <w:gridCol w:w="9026"/>
-      </w:tblGrid>
-      <w:tr>
-        <w:tc>
-          <w:tcPr>
-            <w:tcW w:type="dxa" w:w="9026"/>
-          </w:tcPr>
-          <w:p>
-            <w:pPr>
-              <w:spacing w:after="60"/>
-              <w:jc w:val="both"/>
-            </w:pPr>
-            <w:r>
-              <w:rPr>
-                <w:b w:val="0"/>
-              </w:rPr>
-              <w:t>Human Development: Ensure Quality Education</w:t>
-            </w:r>
-          </w:p>
-          <w:p>
-            <w:pPr>
-              <w:spacing w:after="60"/>
-              <w:jc w:val="both"/>
-            </w:pPr>
-            <w:r>
-              <w:rPr>
-                <w:b/>
-              </w:rPr>
-              <w:t xml:space="preserve">Sub-topic: </w:t>
-            </w:r>
-            <w:r>
-              <w:rPr>
-                <w:b/>
-              </w:rPr>
               <w:t>Small Schools and Single-Teacher Schools in the Monograde System</w:t>
             </w:r>
           </w:p>
@@ -3602,7 +2743,7 @@
           <w:sz w:val="28"/>
           <w:u w:val="none"/>
         </w:rPr>
-        <w:t>Feedback Note 5</w:t>
+        <w:t>Feedback Note 4</w:t>
       </w:r>
     </w:p>
     <w:p>
@@ -4349,7 +3490,7 @@
           <w:sz w:val="28"/>
           <w:u w:val="none"/>
         </w:rPr>
-        <w:t>Feedback Note 6</w:t>
+        <w:t>Feedback Note 5</w:t>
       </w:r>
     </w:p>
     <w:p>
@@ -5096,753 +4237,6 @@
         <w:t>DIET Tumakuru classroom observation practice; DSERT classroom observation Google Form.</w:t>
       </w:r>
     </w:p>
-    <w:p>
-      <w:r>
-        <w:br w:type="page"/>
-      </w:r>
-    </w:p>
-    <w:p>
-      <w:pPr>
-        <w:spacing w:after="120" w:before="0"/>
-        <w:jc w:val="right"/>
-      </w:pPr>
-      <w:r>
-        <w:rPr>
-          <w:b/>
-          <w:i w:val="0"/>
-          <w:u w:val="none"/>
-        </w:rPr>
-        <w:t>Annexure-1</w:t>
-      </w:r>
-    </w:p>
-    <w:p>
-      <w:pPr>
-        <w:spacing w:after="40" w:before="0"/>
-        <w:jc w:val="center"/>
-      </w:pPr>
-      <w:r>
-        <w:rPr>
-          <w:b/>
-          <w:i w:val="0"/>
-          <w:sz w:val="28"/>
-          <w:u w:val="none"/>
-        </w:rPr>
-        <w:t>Feedback Note 7</w:t>
-      </w:r>
-    </w:p>
-    <w:p>
-      <w:pPr>
-        <w:spacing w:after="160" w:before="0"/>
-        <w:jc w:val="center"/>
-      </w:pPr>
-      <w:r>
-        <w:rPr>
-          <w:b w:val="0"/>
-          <w:i/>
-          <w:sz w:val="20"/>
-          <w:u w:val="none"/>
-        </w:rPr>
-        <w:t>(by all IAS officers / State Department Officers / All Probationers of National and State Training Institutes and Academies)</w:t>
-      </w:r>
-    </w:p>
-    <w:p>
-      <w:pPr>
-        <w:spacing w:after="120" w:before="160"/>
-      </w:pPr>
-      <w:r>
-        <w:rPr>
-          <w:b/>
-          <w:i w:val="0"/>
-          <w:sz w:val="24"/>
-          <w:u w:val="none"/>
-        </w:rPr>
-        <w:t>Section 1: Officer Name and Details</w:t>
-      </w:r>
-    </w:p>
-    <w:tbl>
-      <w:tblPr>
-        <w:tblW w:type="auto" w:w="0"/>
-        <w:tblLook w:firstColumn="1" w:firstRow="1" w:lastColumn="0" w:lastRow="0" w:noHBand="0" w:noVBand="1" w:val="04A0"/>
-        <w:tblBorders>
-          <w:top w:val="single" w:sz="4" w:color="000000"/>
-          <w:left w:val="single" w:sz="4" w:color="000000"/>
-          <w:bottom w:val="single" w:sz="4" w:color="000000"/>
-          <w:right w:val="single" w:sz="4" w:color="000000"/>
-          <w:insideH w:val="single" w:sz="4" w:color="000000"/>
-          <w:insideV w:val="single" w:sz="4" w:color="000000"/>
-        </w:tblBorders>
-      </w:tblPr>
-      <w:tblGrid>
-        <w:gridCol w:w="4513"/>
-        <w:gridCol w:w="4513"/>
-      </w:tblGrid>
-      <w:tr>
-        <w:tc>
-          <w:tcPr>
-            <w:tcW w:type="dxa" w:w="3312"/>
-            <w:shd w:val="clear" w:color="auto" w:fill="F2F2F2"/>
-          </w:tcPr>
-          <w:p>
-            <w:pPr>
-              <w:spacing w:after="0"/>
-            </w:pPr>
-            <w:r/>
-            <w:r>
-              <w:rPr>
-                <w:b/>
-              </w:rPr>
-              <w:t>Name</w:t>
-            </w:r>
-          </w:p>
-        </w:tc>
-        <w:tc>
-          <w:tcPr>
-            <w:tcW w:type="dxa" w:w="5760"/>
-          </w:tcPr>
-          <w:p>
-            <w:pPr>
-              <w:spacing w:after="0"/>
-            </w:pPr>
-            <w:r/>
-            <w:r>
-              <w:t>Dr. Padmashree R.P.</w:t>
-            </w:r>
-          </w:p>
-        </w:tc>
-      </w:tr>
-      <w:tr>
-        <w:tc>
-          <w:tcPr>
-            <w:tcW w:type="dxa" w:w="3312"/>
-            <w:shd w:val="clear" w:color="auto" w:fill="F2F2F2"/>
-          </w:tcPr>
-          <w:p>
-            <w:pPr>
-              <w:spacing w:after="0"/>
-            </w:pPr>
-            <w:r/>
-            <w:r>
-              <w:rPr>
-                <w:b/>
-              </w:rPr>
-              <w:t>Designation</w:t>
-            </w:r>
-          </w:p>
-        </w:tc>
-        <w:tc>
-          <w:tcPr>
-            <w:tcW w:type="dxa" w:w="5760"/>
-          </w:tcPr>
-          <w:p>
-            <w:pPr>
-              <w:spacing w:after="0"/>
-            </w:pPr>
-            <w:r/>
-            <w:r>
-              <w:t>Senior Assistant Director, Teacher Education and Research Wing</w:t>
-            </w:r>
-          </w:p>
-        </w:tc>
-      </w:tr>
-      <w:tr>
-        <w:tc>
-          <w:tcPr>
-            <w:tcW w:type="dxa" w:w="3312"/>
-            <w:shd w:val="clear" w:color="auto" w:fill="F2F2F2"/>
-          </w:tcPr>
-          <w:p>
-            <w:pPr>
-              <w:spacing w:after="0"/>
-            </w:pPr>
-            <w:r/>
-            <w:r>
-              <w:rPr>
-                <w:b/>
-              </w:rPr>
-              <w:t>Batch</w:t>
-            </w:r>
-          </w:p>
-        </w:tc>
-        <w:tc>
-          <w:tcPr>
-            <w:tcW w:type="dxa" w:w="5760"/>
-          </w:tcPr>
-          <w:p>
-            <w:pPr>
-              <w:spacing w:after="0"/>
-            </w:pPr>
-            <w:r/>
-            <w:r>
-              <w:t>Not applicable (State Government officer)</w:t>
-            </w:r>
-          </w:p>
-        </w:tc>
-      </w:tr>
-      <w:tr>
-        <w:tc>
-          <w:tcPr>
-            <w:tcW w:type="dxa" w:w="3312"/>
-            <w:shd w:val="clear" w:color="auto" w:fill="F2F2F2"/>
-          </w:tcPr>
-          <w:p>
-            <w:pPr>
-              <w:spacing w:after="0"/>
-            </w:pPr>
-            <w:r/>
-            <w:r>
-              <w:rPr>
-                <w:b/>
-              </w:rPr>
-              <w:t>Current service status</w:t>
-            </w:r>
-          </w:p>
-        </w:tc>
-        <w:tc>
-          <w:tcPr>
-            <w:tcW w:type="dxa" w:w="5760"/>
-          </w:tcPr>
-          <w:p>
-            <w:pPr>
-              <w:spacing w:after="0"/>
-            </w:pPr>
-            <w:r/>
-            <w:r>
-              <w:t>☐ Probationer   ☒ Confirmed</w:t>
-            </w:r>
-          </w:p>
-        </w:tc>
-      </w:tr>
-      <w:tr>
-        <w:tc>
-          <w:tcPr>
-            <w:tcW w:type="dxa" w:w="3312"/>
-            <w:shd w:val="clear" w:color="auto" w:fill="F2F2F2"/>
-          </w:tcPr>
-          <w:p>
-            <w:pPr>
-              <w:spacing w:after="0"/>
-            </w:pPr>
-            <w:r/>
-            <w:r>
-              <w:rPr>
-                <w:b/>
-              </w:rPr>
-              <w:t>Training Institute / Academy (if currently undergoing institutional training)</w:t>
-            </w:r>
-          </w:p>
-        </w:tc>
-        <w:tc>
-          <w:tcPr>
-            <w:tcW w:type="dxa" w:w="5760"/>
-          </w:tcPr>
-          <w:p>
-            <w:pPr>
-              <w:spacing w:after="0"/>
-            </w:pPr>
-            <w:r/>
-            <w:r>
-              <w:t>Not applicable</w:t>
-            </w:r>
-          </w:p>
-        </w:tc>
-      </w:tr>
-      <w:tr>
-        <w:tc>
-          <w:tcPr>
-            <w:tcW w:type="dxa" w:w="3312"/>
-            <w:shd w:val="clear" w:color="auto" w:fill="F2F2F2"/>
-          </w:tcPr>
-          <w:p>
-            <w:pPr>
-              <w:spacing w:after="0"/>
-            </w:pPr>
-            <w:r/>
-            <w:r>
-              <w:rPr>
-                <w:b/>
-              </w:rPr>
-              <w:t>Current Posting</w:t>
-            </w:r>
-          </w:p>
-        </w:tc>
-        <w:tc>
-          <w:tcPr>
-            <w:tcW w:type="dxa" w:w="5760"/>
-          </w:tcPr>
-          <w:p>
-            <w:pPr>
-              <w:spacing w:after="0"/>
-            </w:pPr>
-            <w:r/>
-            <w:r>
-              <w:t>DSERT, Bengaluru</w:t>
-            </w:r>
-          </w:p>
-        </w:tc>
-      </w:tr>
-    </w:tbl>
-    <w:p>
-      <w:pPr>
-        <w:spacing w:after="120" w:before="160"/>
-      </w:pPr>
-      <w:r>
-        <w:rPr>
-          <w:b/>
-          <w:i w:val="0"/>
-          <w:sz w:val="24"/>
-          <w:u w:val="none"/>
-        </w:rPr>
-        <w:t>Section 2: Feedback for Sixth National Conference of Chief Secretaries</w:t>
-      </w:r>
-    </w:p>
-    <w:p>
-      <w:pPr>
-        <w:spacing w:after="120" w:before="160"/>
-      </w:pPr>
-      <w:r>
-        <w:rPr>
-          <w:b/>
-          <w:i w:val="0"/>
-          <w:sz w:val="24"/>
-          <w:u w:val="none"/>
-        </w:rPr>
-        <w:t>1. Name of the topic</w:t>
-      </w:r>
-    </w:p>
-    <w:p>
-      <w:pPr>
-        <w:spacing w:after="80" w:before="0"/>
-      </w:pPr>
-      <w:r>
-        <w:rPr>
-          <w:b w:val="0"/>
-          <w:i/>
-          <w:sz w:val="20"/>
-          <w:u w:val="none"/>
-        </w:rPr>
-        <w:t>(Choose from the topics of the conference)</w:t>
-      </w:r>
-    </w:p>
-    <w:tbl>
-      <w:tblPr>
-        <w:tblW w:type="auto" w:w="0"/>
-        <w:tblLook w:firstColumn="1" w:firstRow="1" w:lastColumn="0" w:lastRow="0" w:noHBand="0" w:noVBand="1" w:val="04A0"/>
-        <w:tblBorders>
-          <w:top w:val="single" w:sz="6" w:color="000000"/>
-          <w:left w:val="single" w:sz="6" w:color="000000"/>
-          <w:bottom w:val="single" w:sz="6" w:color="000000"/>
-          <w:right w:val="single" w:sz="6" w:color="000000"/>
-          <w:insideH w:val="single" w:sz="6" w:color="000000"/>
-          <w:insideV w:val="single" w:sz="6" w:color="000000"/>
-        </w:tblBorders>
-      </w:tblPr>
-      <w:tblGrid>
-        <w:gridCol w:w="9026"/>
-      </w:tblGrid>
-      <w:tr>
-        <w:tc>
-          <w:tcPr>
-            <w:tcW w:type="dxa" w:w="9026"/>
-          </w:tcPr>
-          <w:p>
-            <w:pPr>
-              <w:spacing w:after="60"/>
-              <w:jc w:val="both"/>
-            </w:pPr>
-            <w:r>
-              <w:rPr>
-                <w:b w:val="0"/>
-              </w:rPr>
-              <w:t>Human Development: Ensure Quality Education</w:t>
-            </w:r>
-          </w:p>
-          <w:p>
-            <w:pPr>
-              <w:spacing w:after="60"/>
-              <w:jc w:val="both"/>
-            </w:pPr>
-            <w:r>
-              <w:rPr>
-                <w:b/>
-              </w:rPr>
-              <w:t xml:space="preserve">Sub-topic: </w:t>
-            </w:r>
-            <w:r>
-              <w:rPr>
-                <w:b/>
-              </w:rPr>
-              <w:t>Research on the Monograde Transition</w:t>
-            </w:r>
-          </w:p>
-        </w:tc>
-      </w:tr>
-    </w:tbl>
-    <w:p>
-      <w:pPr>
-        <w:spacing w:after="120" w:before="160"/>
-      </w:pPr>
-      <w:r>
-        <w:rPr>
-          <w:b/>
-          <w:i w:val="0"/>
-          <w:sz w:val="24"/>
-          <w:u w:val="none"/>
-        </w:rPr>
-        <w:t>2. Policy Gaps and Challenges</w:t>
-      </w:r>
-    </w:p>
-    <w:p>
-      <w:pPr>
-        <w:spacing w:after="80" w:before="0"/>
-      </w:pPr>
-      <w:r>
-        <w:rPr>
-          <w:b w:val="0"/>
-          <w:i/>
-          <w:sz w:val="20"/>
-          <w:u w:val="none"/>
-        </w:rPr>
-        <w:t>(Current policy challenges, administrative and implementing challenges with respect to the topic selected)</w:t>
-      </w:r>
-    </w:p>
-    <w:tbl>
-      <w:tblPr>
-        <w:tblW w:type="auto" w:w="0"/>
-        <w:tblLook w:firstColumn="1" w:firstRow="1" w:lastColumn="0" w:lastRow="0" w:noHBand="0" w:noVBand="1" w:val="04A0"/>
-        <w:tblBorders>
-          <w:top w:val="single" w:sz="6" w:color="000000"/>
-          <w:left w:val="single" w:sz="6" w:color="000000"/>
-          <w:bottom w:val="single" w:sz="6" w:color="000000"/>
-          <w:right w:val="single" w:sz="6" w:color="000000"/>
-          <w:insideH w:val="single" w:sz="6" w:color="000000"/>
-          <w:insideV w:val="single" w:sz="6" w:color="000000"/>
-        </w:tblBorders>
-      </w:tblPr>
-      <w:tblGrid>
-        <w:gridCol w:w="9026"/>
-      </w:tblGrid>
-      <w:tr>
-        <w:tc>
-          <w:tcPr>
-            <w:tcW w:type="dxa" w:w="9026"/>
-          </w:tcPr>
-          <w:p>
-            <w:pPr>
-              <w:spacing w:after="60"/>
-              <w:jc w:val="both"/>
-            </w:pPr>
-            <w:r>
-              <w:rPr>
-                <w:b w:val="0"/>
-              </w:rPr>
-              <w:t>The shift from multigrade to monograde classrooms is one of the largest changes in primary education in Karnataka in recent years. Yet the evidence base is thin. DIET studies of Nali Kali and English Nali Kali were mostly perception and implementation studies without comparison groups to measure learning. The main rigorous external study was the multi-year evaluation by Kochar and colleagues (Stanford University, Catalyst Management Services and Azim Premji Foundation).</w:t>
-            </w:r>
-          </w:p>
-          <w:p>
-            <w:pPr>
-              <w:spacing w:after="60"/>
-              <w:jc w:val="both"/>
-            </w:pPr>
-            <w:r>
-              <w:rPr>
-                <w:b w:val="0"/>
-              </w:rPr>
-              <w:t>None of the 234 studies in the DSERT Research Abstracts Compilation 2024-25 and 2025-26 examines the transition itself. Questions such as teacher readiness, the teacher-class ratio in small schools, infrastructure gaps, FLN outcomes before and after the change, and how single-teacher schools manage monograde teaching remain unanswered.</w:t>
-            </w:r>
-          </w:p>
-        </w:tc>
-      </w:tr>
-    </w:tbl>
-    <w:p>
-      <w:pPr>
-        <w:spacing w:after="120" w:before="160"/>
-      </w:pPr>
-      <w:r>
-        <w:rPr>
-          <w:b/>
-          <w:i w:val="0"/>
-          <w:sz w:val="24"/>
-          <w:u w:val="none"/>
-        </w:rPr>
-        <w:t>3. Potential Solutions</w:t>
-      </w:r>
-    </w:p>
-    <w:p>
-      <w:pPr>
-        <w:spacing w:after="80" w:before="0"/>
-      </w:pPr>
-      <w:r>
-        <w:rPr>
-          <w:b w:val="0"/>
-          <w:i/>
-          <w:sz w:val="20"/>
-          <w:u w:val="none"/>
-        </w:rPr>
-        <w:t>(Can potentially highlight new technology solutions, scope for convergence with other schemes/ programmes, etc.)</w:t>
-      </w:r>
-    </w:p>
-    <w:tbl>
-      <w:tblPr>
-        <w:tblW w:type="auto" w:w="0"/>
-        <w:tblLook w:firstColumn="1" w:firstRow="1" w:lastColumn="0" w:lastRow="0" w:noHBand="0" w:noVBand="1" w:val="04A0"/>
-        <w:tblBorders>
-          <w:top w:val="single" w:sz="6" w:color="000000"/>
-          <w:left w:val="single" w:sz="6" w:color="000000"/>
-          <w:bottom w:val="single" w:sz="6" w:color="000000"/>
-          <w:right w:val="single" w:sz="6" w:color="000000"/>
-          <w:insideH w:val="single" w:sz="6" w:color="000000"/>
-          <w:insideV w:val="single" w:sz="6" w:color="000000"/>
-        </w:tblBorders>
-      </w:tblPr>
-      <w:tblGrid>
-        <w:gridCol w:w="9026"/>
-      </w:tblGrid>
-      <w:tr>
-        <w:tc>
-          <w:tcPr>
-            <w:tcW w:type="dxa" w:w="9026"/>
-          </w:tcPr>
-          <w:p>
-            <w:pPr>
-              <w:spacing w:after="60"/>
-              <w:ind w:left="360" w:hanging="259"/>
-              <w:jc w:val="both"/>
-            </w:pPr>
-            <w:r>
-              <w:rPr>
-                <w:b w:val="0"/>
-              </w:rPr>
-              <w:t xml:space="preserve">•  </w:t>
-            </w:r>
-            <w:r>
-              <w:rPr>
-                <w:b w:val="0"/>
-              </w:rPr>
-              <w:t>Include the monograde transition as a priority area in the State Research Programme.</w:t>
-            </w:r>
-          </w:p>
-          <w:p>
-            <w:pPr>
-              <w:spacing w:after="60"/>
-              <w:ind w:left="360" w:hanging="259"/>
-              <w:jc w:val="both"/>
-            </w:pPr>
-            <w:r>
-              <w:rPr>
-                <w:b w:val="0"/>
-              </w:rPr>
-              <w:t xml:space="preserve">•  </w:t>
-            </w:r>
-            <w:r>
-              <w:rPr>
-                <w:b w:val="0"/>
-              </w:rPr>
-              <w:t>Conduct a taluk-level baseline study in 2026-27 while the transition is in progress.</w:t>
-            </w:r>
-          </w:p>
-          <w:p>
-            <w:pPr>
-              <w:spacing w:after="60"/>
-              <w:ind w:left="360" w:hanging="259"/>
-              <w:jc w:val="both"/>
-            </w:pPr>
-            <w:r>
-              <w:rPr>
-                <w:b w:val="0"/>
-              </w:rPr>
-              <w:t xml:space="preserve">•  </w:t>
-            </w:r>
-            <w:r>
-              <w:rPr>
-                <w:b w:val="0"/>
-              </w:rPr>
-              <w:t>Compare learning outcomes of children before and after the change, using comparison groups.</w:t>
-            </w:r>
-          </w:p>
-          <w:p>
-            <w:pPr>
-              <w:spacing w:after="60"/>
-              <w:ind w:left="360" w:hanging="259"/>
-              <w:jc w:val="both"/>
-            </w:pPr>
-            <w:r>
-              <w:rPr>
-                <w:b w:val="0"/>
-              </w:rPr>
-              <w:t xml:space="preserve">•  </w:t>
-            </w:r>
-            <w:r>
-              <w:rPr>
-                <w:b w:val="0"/>
-              </w:rPr>
-              <w:t>Study teacher readiness, workload and training needs in monograde classes.</w:t>
-            </w:r>
-          </w:p>
-          <w:p>
-            <w:pPr>
-              <w:spacing w:after="60"/>
-              <w:ind w:left="360" w:hanging="259"/>
-              <w:jc w:val="both"/>
-            </w:pPr>
-            <w:r>
-              <w:rPr>
-                <w:b w:val="0"/>
-              </w:rPr>
-              <w:t xml:space="preserve">•  </w:t>
-            </w:r>
-            <w:r>
-              <w:rPr>
-                <w:b w:val="0"/>
-              </w:rPr>
-              <w:t>Study how small and single-teacher schools are managing the change.</w:t>
-            </w:r>
-          </w:p>
-          <w:p>
-            <w:pPr>
-              <w:spacing w:after="60"/>
-              <w:ind w:left="360" w:hanging="259"/>
-              <w:jc w:val="both"/>
-            </w:pPr>
-            <w:r>
-              <w:rPr>
-                <w:b w:val="0"/>
-              </w:rPr>
-              <w:t xml:space="preserve">•  </w:t>
-            </w:r>
-            <w:r>
-              <w:rPr>
-                <w:b w:val="0"/>
-              </w:rPr>
-              <w:t>Record infrastructure gaps and how schools are solving them.</w:t>
-            </w:r>
-          </w:p>
-          <w:p>
-            <w:pPr>
-              <w:spacing w:after="60"/>
-              <w:ind w:left="360" w:hanging="259"/>
-              <w:jc w:val="both"/>
-            </w:pPr>
-            <w:r>
-              <w:rPr>
-                <w:b w:val="0"/>
-              </w:rPr>
-              <w:t xml:space="preserve">•  </w:t>
-            </w:r>
-            <w:r>
-              <w:rPr>
-                <w:b w:val="0"/>
-              </w:rPr>
-              <w:t>Share findings through policy briefs, the State research symposium and district plans.</w:t>
-            </w:r>
-          </w:p>
-        </w:tc>
-      </w:tr>
-    </w:tbl>
-    <w:p>
-      <w:pPr>
-        <w:spacing w:after="120" w:before="160"/>
-      </w:pPr>
-      <w:r>
-        <w:rPr>
-          <w:b/>
-          <w:i w:val="0"/>
-          <w:sz w:val="24"/>
-          <w:u w:val="none"/>
-        </w:rPr>
-        <w:t>4. Best Practices</w:t>
-      </w:r>
-    </w:p>
-    <w:p>
-      <w:pPr>
-        <w:spacing w:after="80" w:before="0"/>
-      </w:pPr>
-      <w:r>
-        <w:rPr>
-          <w:b w:val="0"/>
-          <w:i/>
-          <w:sz w:val="20"/>
-          <w:u w:val="none"/>
-        </w:rPr>
-        <w:t>(Highlights the practices, which are sustainable, replicable, scalable, monitorable, etc. Can also highlight the block/district/ State level practices)</w:t>
-      </w:r>
-    </w:p>
-    <w:tbl>
-      <w:tblPr>
-        <w:tblW w:type="auto" w:w="0"/>
-        <w:tblLook w:firstColumn="1" w:firstRow="1" w:lastColumn="0" w:lastRow="0" w:noHBand="0" w:noVBand="1" w:val="04A0"/>
-        <w:tblBorders>
-          <w:top w:val="single" w:sz="6" w:color="000000"/>
-          <w:left w:val="single" w:sz="6" w:color="000000"/>
-          <w:bottom w:val="single" w:sz="6" w:color="000000"/>
-          <w:right w:val="single" w:sz="6" w:color="000000"/>
-          <w:insideH w:val="single" w:sz="6" w:color="000000"/>
-          <w:insideV w:val="single" w:sz="6" w:color="000000"/>
-        </w:tblBorders>
-      </w:tblPr>
-      <w:tblGrid>
-        <w:gridCol w:w="9026"/>
-      </w:tblGrid>
-      <w:tr>
-        <w:tc>
-          <w:tcPr>
-            <w:tcW w:type="dxa" w:w="9026"/>
-          </w:tcPr>
-          <w:p>
-            <w:pPr>
-              <w:spacing w:after="60"/>
-              <w:jc w:val="both"/>
-            </w:pPr>
-            <w:r>
-              <w:rPr>
-                <w:b w:val="0"/>
-              </w:rPr>
-              <w:t>The DSERT Research Studies Tracker 2026-27 (as on 13 October 2026) already includes studies that will inform the transition. DIET Chitradurga is studying the challenges faced by teachers in monograde classes of Classes 1 to 5. DIET Mandya is studying the FLN achievement of children completing the foundational stage. DIET Gadag, DIET Tumakuru, DIET Bagalkote and DIET Shivamogga are studying Karnataka Public Schools, their conversion, institutional performance and leadership.</w:t>
-            </w:r>
-          </w:p>
-          <w:p>
-            <w:pPr>
-              <w:spacing w:after="60"/>
-              <w:jc w:val="both"/>
-            </w:pPr>
-            <w:r>
-              <w:rPr>
-                <w:b w:val="0"/>
-              </w:rPr>
-              <w:t>Each DIET is supported with up to Rs 10 lakh for research under Samagra Shiksha, with quarterly reports and final reports due in March 2027. This is a good example of building research into the implementation of a major reform. It can be monitored through the State Research Studies Tracker and the use of findings in district and State plans.</w:t>
-            </w:r>
-          </w:p>
-        </w:tc>
-      </w:tr>
-    </w:tbl>
-    <w:p>
-      <w:pPr>
-        <w:spacing w:after="120" w:before="160"/>
-      </w:pPr>
-      <w:r>
-        <w:rPr>
-          <w:b/>
-          <w:i w:val="0"/>
-          <w:sz w:val="24"/>
-          <w:u w:val="none"/>
-        </w:rPr>
-        <w:t>References</w:t>
-      </w:r>
-    </w:p>
-    <w:p>
-      <w:pPr>
-        <w:spacing w:after="60" w:before="0"/>
-        <w:ind w:left="576" w:hanging="576"/>
-        <w:jc w:val="both"/>
-      </w:pPr>
-      <w:r>
-        <w:rPr>
-          <w:b w:val="0"/>
-          <w:i w:val="0"/>
-          <w:u w:val="none"/>
-        </w:rPr>
-        <w:t>DSERT Research Studies Tracker 2026-27; DSERT Research Abstracts Compilation 2024-25 and 2025-26; Kochar, A. et al. (2013), Nali Kali: Enabling for learning.</w:t>
-      </w:r>
-    </w:p>
     <w:sectPr>
       <w:footerReference w:type="default" r:id="rId9"/>
       <w:pgSz w:w="11906" w:h="16838"/>

</xml_diff>

<commit_message>
Restore teacher preparation and research notes in monograde Annexure-1, with Nali Kali references removed
Co-Authored-By: Claude Opus 5.5 <noreply@anthropic.com>
Claude-Session: https://claude.ai/code/session_01TmoA8EnDu8b3BBjWmeLWrr
</commit_message>
<xml_diff>
--- a/rewrites/cs-conference-feedback/Monograde_Education_Feedback_Notes_Annexure1.docx
+++ b/rewrites/cs-conference-feedback/Monograde_Education_Feedback_Notes_Annexure1.docx
@@ -336,7 +336,7 @@
               <w:rPr>
                 <w:sz w:val="20"/>
               </w:rPr>
-              <w:t>Small Schools and Single-Teacher Schools in the Monograde System</w:t>
+              <w:t>Teacher Preparation for Monograde Teaching</w:t>
             </w:r>
           </w:p>
         </w:tc>
@@ -392,7 +392,7 @@
               <w:rPr>
                 <w:sz w:val="20"/>
               </w:rPr>
-              <w:t>Monitoring Foundational Literacy and Numeracy during the Transition</w:t>
+              <w:t>Small Schools and Single-Teacher Schools in the Monograde System</w:t>
             </w:r>
           </w:p>
         </w:tc>
@@ -448,6 +448,62 @@
               <w:rPr>
                 <w:sz w:val="20"/>
               </w:rPr>
+              <w:t>Monitoring Foundational Literacy and Numeracy during the Transition</w:t>
+            </w:r>
+          </w:p>
+        </w:tc>
+        <w:tc>
+          <w:tcPr>
+            <w:tcW w:type="dxa" w:w="2736"/>
+          </w:tcPr>
+          <w:p>
+            <w:pPr>
+              <w:spacing w:after="0"/>
+            </w:pPr>
+            <w:r/>
+            <w:r>
+              <w:rPr>
+                <w:sz w:val="20"/>
+              </w:rPr>
+              <w:t>DSERT, Bengaluru</w:t>
+            </w:r>
+          </w:p>
+        </w:tc>
+      </w:tr>
+      <w:tr>
+        <w:trPr>
+          <w:cantSplit/>
+        </w:trPr>
+        <w:tc>
+          <w:tcPr>
+            <w:tcW w:type="dxa" w:w="720"/>
+          </w:tcPr>
+          <w:p>
+            <w:pPr>
+              <w:spacing w:after="0"/>
+            </w:pPr>
+            <w:r/>
+            <w:r>
+              <w:rPr>
+                <w:sz w:val="20"/>
+              </w:rPr>
+              <w:t>6</w:t>
+            </w:r>
+          </w:p>
+        </w:tc>
+        <w:tc>
+          <w:tcPr>
+            <w:tcW w:type="dxa" w:w="5616"/>
+          </w:tcPr>
+          <w:p>
+            <w:pPr>
+              <w:spacing w:after="0"/>
+            </w:pPr>
+            <w:r/>
+            <w:r>
+              <w:rPr>
+                <w:sz w:val="20"/>
+              </w:rPr>
               <w:t>Monograde Education: Classroom Visits by BRPs, CRPs and DIET Faculty; Feedback to Teachers; Data and Reporting Requirements; Escalation and Resolution of Problems</w:t>
             </w:r>
           </w:p>
@@ -466,6 +522,62 @@
                 <w:sz w:val="20"/>
               </w:rPr>
               <w:t>DIET, Tumakuru</w:t>
+            </w:r>
+          </w:p>
+        </w:tc>
+      </w:tr>
+      <w:tr>
+        <w:trPr>
+          <w:cantSplit/>
+        </w:trPr>
+        <w:tc>
+          <w:tcPr>
+            <w:tcW w:type="dxa" w:w="720"/>
+          </w:tcPr>
+          <w:p>
+            <w:pPr>
+              <w:spacing w:after="0"/>
+            </w:pPr>
+            <w:r/>
+            <w:r>
+              <w:rPr>
+                <w:sz w:val="20"/>
+              </w:rPr>
+              <w:t>7</w:t>
+            </w:r>
+          </w:p>
+        </w:tc>
+        <w:tc>
+          <w:tcPr>
+            <w:tcW w:type="dxa" w:w="5616"/>
+          </w:tcPr>
+          <w:p>
+            <w:pPr>
+              <w:spacing w:after="0"/>
+            </w:pPr>
+            <w:r/>
+            <w:r>
+              <w:rPr>
+                <w:sz w:val="20"/>
+              </w:rPr>
+              <w:t>Research on the Monograde Transition</w:t>
+            </w:r>
+          </w:p>
+        </w:tc>
+        <w:tc>
+          <w:tcPr>
+            <w:tcW w:type="dxa" w:w="2736"/>
+          </w:tcPr>
+          <w:p>
+            <w:pPr>
+              <w:spacing w:after="0"/>
+            </w:pPr>
+            <w:r/>
+            <w:r>
+              <w:rPr>
+                <w:sz w:val="20"/>
+              </w:rPr>
+              <w:t>DSERT, Bengaluru</w:t>
             </w:r>
           </w:p>
         </w:tc>
@@ -1835,25 +1947,6 @@
               <w:rPr>
                 <w:b w:val="0"/>
               </w:rPr>
-              <w:t>Use the Nali Kali materials already in schools, where suitable, for activity corners in each class.</w:t>
-            </w:r>
-          </w:p>
-          <w:p>
-            <w:pPr>
-              <w:spacing w:after="60"/>
-              <w:ind w:left="360" w:hanging="259"/>
-              <w:jc w:val="both"/>
-            </w:pPr>
-            <w:r>
-              <w:rPr>
-                <w:b w:val="0"/>
-              </w:rPr>
-              <w:t xml:space="preserve">•  </w:t>
-            </w:r>
-            <w:r>
-              <w:rPr>
-                <w:b w:val="0"/>
-              </w:rPr>
               <w:t>Monitor the availability of rooms and furniture for each class through SATS and school visits.</w:t>
             </w:r>
           </w:p>
@@ -1997,6 +2090,753 @@
           <w:u w:val="none"/>
         </w:rPr>
         <w:t>Feedback Note 3</w:t>
+      </w:r>
+    </w:p>
+    <w:p>
+      <w:pPr>
+        <w:spacing w:after="160" w:before="0"/>
+        <w:jc w:val="center"/>
+      </w:pPr>
+      <w:r>
+        <w:rPr>
+          <w:b w:val="0"/>
+          <w:i/>
+          <w:sz w:val="20"/>
+          <w:u w:val="none"/>
+        </w:rPr>
+        <w:t>(by all IAS officers / State Department Officers / All Probationers of National and State Training Institutes and Academies)</w:t>
+      </w:r>
+    </w:p>
+    <w:p>
+      <w:pPr>
+        <w:spacing w:after="120" w:before="160"/>
+      </w:pPr>
+      <w:r>
+        <w:rPr>
+          <w:b/>
+          <w:i w:val="0"/>
+          <w:sz w:val="24"/>
+          <w:u w:val="none"/>
+        </w:rPr>
+        <w:t>Section 1: Officer Name and Details</w:t>
+      </w:r>
+    </w:p>
+    <w:tbl>
+      <w:tblPr>
+        <w:tblW w:type="auto" w:w="0"/>
+        <w:tblLook w:firstColumn="1" w:firstRow="1" w:lastColumn="0" w:lastRow="0" w:noHBand="0" w:noVBand="1" w:val="04A0"/>
+        <w:tblBorders>
+          <w:top w:val="single" w:sz="4" w:color="000000"/>
+          <w:left w:val="single" w:sz="4" w:color="000000"/>
+          <w:bottom w:val="single" w:sz="4" w:color="000000"/>
+          <w:right w:val="single" w:sz="4" w:color="000000"/>
+          <w:insideH w:val="single" w:sz="4" w:color="000000"/>
+          <w:insideV w:val="single" w:sz="4" w:color="000000"/>
+        </w:tblBorders>
+      </w:tblPr>
+      <w:tblGrid>
+        <w:gridCol w:w="4513"/>
+        <w:gridCol w:w="4513"/>
+      </w:tblGrid>
+      <w:tr>
+        <w:tc>
+          <w:tcPr>
+            <w:tcW w:type="dxa" w:w="3312"/>
+            <w:shd w:val="clear" w:color="auto" w:fill="F2F2F2"/>
+          </w:tcPr>
+          <w:p>
+            <w:pPr>
+              <w:spacing w:after="0"/>
+            </w:pPr>
+            <w:r/>
+            <w:r>
+              <w:rPr>
+                <w:b/>
+              </w:rPr>
+              <w:t>Name</w:t>
+            </w:r>
+          </w:p>
+        </w:tc>
+        <w:tc>
+          <w:tcPr>
+            <w:tcW w:type="dxa" w:w="5760"/>
+          </w:tcPr>
+          <w:p>
+            <w:pPr>
+              <w:spacing w:after="0"/>
+            </w:pPr>
+            <w:r/>
+            <w:r>
+              <w:t>Dr. Padmashree R.P.</w:t>
+            </w:r>
+          </w:p>
+        </w:tc>
+      </w:tr>
+      <w:tr>
+        <w:tc>
+          <w:tcPr>
+            <w:tcW w:type="dxa" w:w="3312"/>
+            <w:shd w:val="clear" w:color="auto" w:fill="F2F2F2"/>
+          </w:tcPr>
+          <w:p>
+            <w:pPr>
+              <w:spacing w:after="0"/>
+            </w:pPr>
+            <w:r/>
+            <w:r>
+              <w:rPr>
+                <w:b/>
+              </w:rPr>
+              <w:t>Designation</w:t>
+            </w:r>
+          </w:p>
+        </w:tc>
+        <w:tc>
+          <w:tcPr>
+            <w:tcW w:type="dxa" w:w="5760"/>
+          </w:tcPr>
+          <w:p>
+            <w:pPr>
+              <w:spacing w:after="0"/>
+            </w:pPr>
+            <w:r/>
+            <w:r>
+              <w:t>Senior Assistant Director, Teacher Education and Research Wing</w:t>
+            </w:r>
+          </w:p>
+        </w:tc>
+      </w:tr>
+      <w:tr>
+        <w:tc>
+          <w:tcPr>
+            <w:tcW w:type="dxa" w:w="3312"/>
+            <w:shd w:val="clear" w:color="auto" w:fill="F2F2F2"/>
+          </w:tcPr>
+          <w:p>
+            <w:pPr>
+              <w:spacing w:after="0"/>
+            </w:pPr>
+            <w:r/>
+            <w:r>
+              <w:rPr>
+                <w:b/>
+              </w:rPr>
+              <w:t>Batch</w:t>
+            </w:r>
+          </w:p>
+        </w:tc>
+        <w:tc>
+          <w:tcPr>
+            <w:tcW w:type="dxa" w:w="5760"/>
+          </w:tcPr>
+          <w:p>
+            <w:pPr>
+              <w:spacing w:after="0"/>
+            </w:pPr>
+            <w:r/>
+            <w:r>
+              <w:t>Not applicable (State Government officer)</w:t>
+            </w:r>
+          </w:p>
+        </w:tc>
+      </w:tr>
+      <w:tr>
+        <w:tc>
+          <w:tcPr>
+            <w:tcW w:type="dxa" w:w="3312"/>
+            <w:shd w:val="clear" w:color="auto" w:fill="F2F2F2"/>
+          </w:tcPr>
+          <w:p>
+            <w:pPr>
+              <w:spacing w:after="0"/>
+            </w:pPr>
+            <w:r/>
+            <w:r>
+              <w:rPr>
+                <w:b/>
+              </w:rPr>
+              <w:t>Current service status</w:t>
+            </w:r>
+          </w:p>
+        </w:tc>
+        <w:tc>
+          <w:tcPr>
+            <w:tcW w:type="dxa" w:w="5760"/>
+          </w:tcPr>
+          <w:p>
+            <w:pPr>
+              <w:spacing w:after="0"/>
+            </w:pPr>
+            <w:r/>
+            <w:r>
+              <w:t>☐ Probationer   ☒ Confirmed</w:t>
+            </w:r>
+          </w:p>
+        </w:tc>
+      </w:tr>
+      <w:tr>
+        <w:tc>
+          <w:tcPr>
+            <w:tcW w:type="dxa" w:w="3312"/>
+            <w:shd w:val="clear" w:color="auto" w:fill="F2F2F2"/>
+          </w:tcPr>
+          <w:p>
+            <w:pPr>
+              <w:spacing w:after="0"/>
+            </w:pPr>
+            <w:r/>
+            <w:r>
+              <w:rPr>
+                <w:b/>
+              </w:rPr>
+              <w:t>Training Institute / Academy (if currently undergoing institutional training)</w:t>
+            </w:r>
+          </w:p>
+        </w:tc>
+        <w:tc>
+          <w:tcPr>
+            <w:tcW w:type="dxa" w:w="5760"/>
+          </w:tcPr>
+          <w:p>
+            <w:pPr>
+              <w:spacing w:after="0"/>
+            </w:pPr>
+            <w:r/>
+            <w:r>
+              <w:t>Not applicable</w:t>
+            </w:r>
+          </w:p>
+        </w:tc>
+      </w:tr>
+      <w:tr>
+        <w:tc>
+          <w:tcPr>
+            <w:tcW w:type="dxa" w:w="3312"/>
+            <w:shd w:val="clear" w:color="auto" w:fill="F2F2F2"/>
+          </w:tcPr>
+          <w:p>
+            <w:pPr>
+              <w:spacing w:after="0"/>
+            </w:pPr>
+            <w:r/>
+            <w:r>
+              <w:rPr>
+                <w:b/>
+              </w:rPr>
+              <w:t>Current Posting</w:t>
+            </w:r>
+          </w:p>
+        </w:tc>
+        <w:tc>
+          <w:tcPr>
+            <w:tcW w:type="dxa" w:w="5760"/>
+          </w:tcPr>
+          <w:p>
+            <w:pPr>
+              <w:spacing w:after="0"/>
+            </w:pPr>
+            <w:r/>
+            <w:r>
+              <w:t>DSERT, Bengaluru</w:t>
+            </w:r>
+          </w:p>
+        </w:tc>
+      </w:tr>
+    </w:tbl>
+    <w:p>
+      <w:pPr>
+        <w:spacing w:after="120" w:before="160"/>
+      </w:pPr>
+      <w:r>
+        <w:rPr>
+          <w:b/>
+          <w:i w:val="0"/>
+          <w:sz w:val="24"/>
+          <w:u w:val="none"/>
+        </w:rPr>
+        <w:t>Section 2: Feedback for Sixth National Conference of Chief Secretaries</w:t>
+      </w:r>
+    </w:p>
+    <w:p>
+      <w:pPr>
+        <w:spacing w:after="120" w:before="160"/>
+      </w:pPr>
+      <w:r>
+        <w:rPr>
+          <w:b/>
+          <w:i w:val="0"/>
+          <w:sz w:val="24"/>
+          <w:u w:val="none"/>
+        </w:rPr>
+        <w:t>1. Name of the topic</w:t>
+      </w:r>
+    </w:p>
+    <w:p>
+      <w:pPr>
+        <w:spacing w:after="80" w:before="0"/>
+      </w:pPr>
+      <w:r>
+        <w:rPr>
+          <w:b w:val="0"/>
+          <w:i/>
+          <w:sz w:val="20"/>
+          <w:u w:val="none"/>
+        </w:rPr>
+        <w:t>(Choose from the topics of the conference)</w:t>
+      </w:r>
+    </w:p>
+    <w:tbl>
+      <w:tblPr>
+        <w:tblW w:type="auto" w:w="0"/>
+        <w:tblLook w:firstColumn="1" w:firstRow="1" w:lastColumn="0" w:lastRow="0" w:noHBand="0" w:noVBand="1" w:val="04A0"/>
+        <w:tblBorders>
+          <w:top w:val="single" w:sz="6" w:color="000000"/>
+          <w:left w:val="single" w:sz="6" w:color="000000"/>
+          <w:bottom w:val="single" w:sz="6" w:color="000000"/>
+          <w:right w:val="single" w:sz="6" w:color="000000"/>
+          <w:insideH w:val="single" w:sz="6" w:color="000000"/>
+          <w:insideV w:val="single" w:sz="6" w:color="000000"/>
+        </w:tblBorders>
+      </w:tblPr>
+      <w:tblGrid>
+        <w:gridCol w:w="9026"/>
+      </w:tblGrid>
+      <w:tr>
+        <w:tc>
+          <w:tcPr>
+            <w:tcW w:type="dxa" w:w="9026"/>
+          </w:tcPr>
+          <w:p>
+            <w:pPr>
+              <w:spacing w:after="60"/>
+              <w:jc w:val="both"/>
+            </w:pPr>
+            <w:r>
+              <w:rPr>
+                <w:b w:val="0"/>
+              </w:rPr>
+              <w:t>Human Development: Ensure Quality Education</w:t>
+            </w:r>
+          </w:p>
+          <w:p>
+            <w:pPr>
+              <w:spacing w:after="60"/>
+              <w:jc w:val="both"/>
+            </w:pPr>
+            <w:r>
+              <w:rPr>
+                <w:b/>
+              </w:rPr>
+              <w:t xml:space="preserve">Sub-topic: </w:t>
+            </w:r>
+            <w:r>
+              <w:rPr>
+                <w:b/>
+              </w:rPr>
+              <w:t>Teacher Preparation for Monograde Teaching</w:t>
+            </w:r>
+          </w:p>
+        </w:tc>
+      </w:tr>
+    </w:tbl>
+    <w:p>
+      <w:pPr>
+        <w:spacing w:after="120" w:before="160"/>
+      </w:pPr>
+      <w:r>
+        <w:rPr>
+          <w:b/>
+          <w:i w:val="0"/>
+          <w:sz w:val="24"/>
+          <w:u w:val="none"/>
+        </w:rPr>
+        <w:t>2. Policy Gaps and Challenges</w:t>
+      </w:r>
+    </w:p>
+    <w:p>
+      <w:pPr>
+        <w:spacing w:after="80" w:before="0"/>
+      </w:pPr>
+      <w:r>
+        <w:rPr>
+          <w:b w:val="0"/>
+          <w:i/>
+          <w:sz w:val="20"/>
+          <w:u w:val="none"/>
+        </w:rPr>
+        <w:t>(Current policy challenges, administrative and implementing challenges with respect to the topic selected)</w:t>
+      </w:r>
+    </w:p>
+    <w:tbl>
+      <w:tblPr>
+        <w:tblW w:type="auto" w:w="0"/>
+        <w:tblLook w:firstColumn="1" w:firstRow="1" w:lastColumn="0" w:lastRow="0" w:noHBand="0" w:noVBand="1" w:val="04A0"/>
+        <w:tblBorders>
+          <w:top w:val="single" w:sz="6" w:color="000000"/>
+          <w:left w:val="single" w:sz="6" w:color="000000"/>
+          <w:bottom w:val="single" w:sz="6" w:color="000000"/>
+          <w:right w:val="single" w:sz="6" w:color="000000"/>
+          <w:insideH w:val="single" w:sz="6" w:color="000000"/>
+          <w:insideV w:val="single" w:sz="6" w:color="000000"/>
+        </w:tblBorders>
+      </w:tblPr>
+      <w:tblGrid>
+        <w:gridCol w:w="9026"/>
+      </w:tblGrid>
+      <w:tr>
+        <w:tc>
+          <w:tcPr>
+            <w:tcW w:type="dxa" w:w="9026"/>
+          </w:tcPr>
+          <w:p>
+            <w:pPr>
+              <w:spacing w:after="60"/>
+              <w:jc w:val="both"/>
+            </w:pPr>
+            <w:r>
+              <w:rPr>
+                <w:b w:val="0"/>
+              </w:rPr>
+              <w:t>For nearly two decades, primary teachers were trained to teach Classes 1 to 3 together using group-based, multi-level methods. Monograde teaching needs different skills: grade-specific lesson planning, greater subject depth, whole-class and group teaching within one grade, and differentiated support for children at different levels in the same class.</w:t>
+            </w:r>
+          </w:p>
+          <w:p>
+            <w:pPr>
+              <w:spacing w:after="60"/>
+              <w:jc w:val="both"/>
+            </w:pPr>
+            <w:r>
+              <w:rPr>
+                <w:b w:val="0"/>
+              </w:rPr>
+              <w:t>DIET studies show that training is the key to good implementation. DIET Chamarajanagar found that trained teachers used activity-based methods and continuous assessment more confidently, but some teachers saw academic monitoring as inspection. The 2026-27 DIET Chitradurga study on the challenges faced by teachers in monograde classes of Classes 1 to 5 shows that this is already a concern in the field.</w:t>
+            </w:r>
+          </w:p>
+        </w:tc>
+      </w:tr>
+    </w:tbl>
+    <w:p>
+      <w:pPr>
+        <w:spacing w:after="120" w:before="160"/>
+      </w:pPr>
+      <w:r>
+        <w:rPr>
+          <w:b/>
+          <w:i w:val="0"/>
+          <w:sz w:val="24"/>
+          <w:u w:val="none"/>
+        </w:rPr>
+        <w:t>3. Potential Solutions</w:t>
+      </w:r>
+    </w:p>
+    <w:p>
+      <w:pPr>
+        <w:spacing w:after="80" w:before="0"/>
+      </w:pPr>
+      <w:r>
+        <w:rPr>
+          <w:b w:val="0"/>
+          <w:i/>
+          <w:sz w:val="20"/>
+          <w:u w:val="none"/>
+        </w:rPr>
+        <w:t>(Can potentially highlight new technology solutions, scope for convergence with other schemes/ programmes, etc.)</w:t>
+      </w:r>
+    </w:p>
+    <w:tbl>
+      <w:tblPr>
+        <w:tblW w:type="auto" w:w="0"/>
+        <w:tblLook w:firstColumn="1" w:firstRow="1" w:lastColumn="0" w:lastRow="0" w:noHBand="0" w:noVBand="1" w:val="04A0"/>
+        <w:tblBorders>
+          <w:top w:val="single" w:sz="6" w:color="000000"/>
+          <w:left w:val="single" w:sz="6" w:color="000000"/>
+          <w:bottom w:val="single" w:sz="6" w:color="000000"/>
+          <w:right w:val="single" w:sz="6" w:color="000000"/>
+          <w:insideH w:val="single" w:sz="6" w:color="000000"/>
+          <w:insideV w:val="single" w:sz="6" w:color="000000"/>
+        </w:tblBorders>
+      </w:tblPr>
+      <w:tblGrid>
+        <w:gridCol w:w="9026"/>
+      </w:tblGrid>
+      <w:tr>
+        <w:tc>
+          <w:tcPr>
+            <w:tcW w:type="dxa" w:w="9026"/>
+          </w:tcPr>
+          <w:p>
+            <w:pPr>
+              <w:spacing w:after="60"/>
+              <w:ind w:left="360" w:hanging="259"/>
+              <w:jc w:val="both"/>
+            </w:pPr>
+            <w:r>
+              <w:rPr>
+                <w:b w:val="0"/>
+              </w:rPr>
+              <w:t xml:space="preserve">•  </w:t>
+            </w:r>
+            <w:r>
+              <w:rPr>
+                <w:b w:val="0"/>
+              </w:rPr>
+              <w:t>Develop DIET training modules on grade-specific lesson planning and competency-based teaching for Classes 1 to 5.</w:t>
+            </w:r>
+          </w:p>
+          <w:p>
+            <w:pPr>
+              <w:spacing w:after="60"/>
+              <w:ind w:left="360" w:hanging="259"/>
+              <w:jc w:val="both"/>
+            </w:pPr>
+            <w:r>
+              <w:rPr>
+                <w:b w:val="0"/>
+              </w:rPr>
+              <w:t xml:space="preserve">•  </w:t>
+            </w:r>
+            <w:r>
+              <w:rPr>
+                <w:b w:val="0"/>
+              </w:rPr>
+              <w:t>Train teachers in differentiated instruction and remedial grouping within one grade.</w:t>
+            </w:r>
+          </w:p>
+          <w:p>
+            <w:pPr>
+              <w:spacing w:after="60"/>
+              <w:ind w:left="360" w:hanging="259"/>
+              <w:jc w:val="both"/>
+            </w:pPr>
+            <w:r>
+              <w:rPr>
+                <w:b w:val="0"/>
+              </w:rPr>
+              <w:t xml:space="preserve">•  </w:t>
+            </w:r>
+            <w:r>
+              <w:rPr>
+                <w:b w:val="0"/>
+              </w:rPr>
+              <w:t>Train all primary teachers, including newly appointed and guest teachers, before and during the transition.</w:t>
+            </w:r>
+          </w:p>
+          <w:p>
+            <w:pPr>
+              <w:spacing w:after="60"/>
+              <w:ind w:left="360" w:hanging="259"/>
+              <w:jc w:val="both"/>
+            </w:pPr>
+            <w:r>
+              <w:rPr>
+                <w:b w:val="0"/>
+              </w:rPr>
+              <w:t xml:space="preserve">•  </w:t>
+            </w:r>
+            <w:r>
+              <w:rPr>
+                <w:b w:val="0"/>
+              </w:rPr>
+              <w:t>Provide practice-based refresher training, workshops and experience-sharing meetings at cluster level.</w:t>
+            </w:r>
+          </w:p>
+          <w:p>
+            <w:pPr>
+              <w:spacing w:after="60"/>
+              <w:ind w:left="360" w:hanging="259"/>
+              <w:jc w:val="both"/>
+            </w:pPr>
+            <w:r>
+              <w:rPr>
+                <w:b w:val="0"/>
+              </w:rPr>
+              <w:t xml:space="preserve">•  </w:t>
+            </w:r>
+            <w:r>
+              <w:rPr>
+                <w:b w:val="0"/>
+              </w:rPr>
+              <w:t>Use DIKSHA and other digital resources for short, self-paced teacher learning modules.</w:t>
+            </w:r>
+          </w:p>
+          <w:p>
+            <w:pPr>
+              <w:spacing w:after="60"/>
+              <w:ind w:left="360" w:hanging="259"/>
+              <w:jc w:val="both"/>
+            </w:pPr>
+            <w:r>
+              <w:rPr>
+                <w:b w:val="0"/>
+              </w:rPr>
+              <w:t xml:space="preserve">•  </w:t>
+            </w:r>
+            <w:r>
+              <w:rPr>
+                <w:b w:val="0"/>
+              </w:rPr>
+              <w:t>Make CRP and BRP visits supportive and mentoring-oriented rather than inspection-oriented.</w:t>
+            </w:r>
+          </w:p>
+          <w:p>
+            <w:pPr>
+              <w:spacing w:after="60"/>
+              <w:ind w:left="360" w:hanging="259"/>
+              <w:jc w:val="both"/>
+            </w:pPr>
+            <w:r>
+              <w:rPr>
+                <w:b w:val="0"/>
+              </w:rPr>
+              <w:t xml:space="preserve">•  </w:t>
+            </w:r>
+            <w:r>
+              <w:rPr>
+                <w:b w:val="0"/>
+              </w:rPr>
+              <w:t>Continue training support for teachers in small schools that must manage more than one class for some time.</w:t>
+            </w:r>
+          </w:p>
+        </w:tc>
+      </w:tr>
+    </w:tbl>
+    <w:p>
+      <w:pPr>
+        <w:spacing w:after="120" w:before="160"/>
+      </w:pPr>
+      <w:r>
+        <w:rPr>
+          <w:b/>
+          <w:i w:val="0"/>
+          <w:sz w:val="24"/>
+          <w:u w:val="none"/>
+        </w:rPr>
+        <w:t>4. Best Practices</w:t>
+      </w:r>
+    </w:p>
+    <w:p>
+      <w:pPr>
+        <w:spacing w:after="80" w:before="0"/>
+      </w:pPr>
+      <w:r>
+        <w:rPr>
+          <w:b w:val="0"/>
+          <w:i/>
+          <w:sz w:val="20"/>
+          <w:u w:val="none"/>
+        </w:rPr>
+        <w:t>(Highlights the practices, which are sustainable, replicable, scalable, monitorable, etc. Can also highlight the block/district/ State level practices)</w:t>
+      </w:r>
+    </w:p>
+    <w:tbl>
+      <w:tblPr>
+        <w:tblW w:type="auto" w:w="0"/>
+        <w:tblLook w:firstColumn="1" w:firstRow="1" w:lastColumn="0" w:lastRow="0" w:noHBand="0" w:noVBand="1" w:val="04A0"/>
+        <w:tblBorders>
+          <w:top w:val="single" w:sz="6" w:color="000000"/>
+          <w:left w:val="single" w:sz="6" w:color="000000"/>
+          <w:bottom w:val="single" w:sz="6" w:color="000000"/>
+          <w:right w:val="single" w:sz="6" w:color="000000"/>
+          <w:insideH w:val="single" w:sz="6" w:color="000000"/>
+          <w:insideV w:val="single" w:sz="6" w:color="000000"/>
+        </w:tblBorders>
+      </w:tblPr>
+      <w:tblGrid>
+        <w:gridCol w:w="9026"/>
+      </w:tblGrid>
+      <w:tr>
+        <w:tc>
+          <w:tcPr>
+            <w:tcW w:type="dxa" w:w="9026"/>
+          </w:tcPr>
+          <w:p>
+            <w:pPr>
+              <w:spacing w:after="60"/>
+              <w:jc w:val="both"/>
+            </w:pPr>
+            <w:r>
+              <w:rPr>
+                <w:b w:val="0"/>
+              </w:rPr>
+              <w:t>DIET Chamarajanagar's study found that ninety-six per cent of head teachers and ninety-seven per cent of teachers had received FLN training, and that trained teachers followed activity-based, child-centred methods and continuous assessment more confidently. Learning Corners were used effectively in ninety-two per cent of schools, and varied teaching methods in ninety-four per cent. Good practices included supportive academic monitoring by head teachers, CRPs and BRPs.</w:t>
+            </w:r>
+          </w:p>
+          <w:p>
+            <w:pPr>
+              <w:spacing w:after="60"/>
+              <w:jc w:val="both"/>
+            </w:pPr>
+            <w:r>
+              <w:rPr>
+                <w:b w:val="0"/>
+              </w:rPr>
+              <w:t>This shows that large-scale teacher training through DIETs and cluster structures can reach almost every teacher. The same system can be used to prepare teachers for monograde classrooms. This is a good example of using the existing DIET-BRC-CRC network for timely capacity building. It can be monitored through training coverage, classroom observation of grade-specific teaching and teachers' feedback.</w:t>
+            </w:r>
+          </w:p>
+        </w:tc>
+      </w:tr>
+    </w:tbl>
+    <w:p>
+      <w:pPr>
+        <w:spacing w:after="120" w:before="160"/>
+      </w:pPr>
+      <w:r>
+        <w:rPr>
+          <w:b/>
+          <w:i w:val="0"/>
+          <w:sz w:val="24"/>
+          <w:u w:val="none"/>
+        </w:rPr>
+        <w:t>References</w:t>
+      </w:r>
+    </w:p>
+    <w:p>
+      <w:pPr>
+        <w:spacing w:after="60" w:before="0"/>
+        <w:ind w:left="576" w:hanging="576"/>
+        <w:jc w:val="both"/>
+      </w:pPr>
+      <w:r>
+        <w:rPr>
+          <w:b w:val="0"/>
+          <w:i w:val="0"/>
+          <w:u w:val="none"/>
+        </w:rPr>
+        <w:t>DIET Chamarajanagar (2025-26); DSERT Research Studies Tracker 2026-27 (DIET Chitradurga study).</w:t>
+      </w:r>
+    </w:p>
+    <w:p>
+      <w:r>
+        <w:br w:type="page"/>
+      </w:r>
+    </w:p>
+    <w:p>
+      <w:pPr>
+        <w:spacing w:after="120" w:before="0"/>
+        <w:jc w:val="right"/>
+      </w:pPr>
+      <w:r>
+        <w:rPr>
+          <w:b/>
+          <w:i w:val="0"/>
+          <w:u w:val="none"/>
+        </w:rPr>
+        <w:t>Annexure-1</w:t>
+      </w:r>
+    </w:p>
+    <w:p>
+      <w:pPr>
+        <w:spacing w:after="40" w:before="0"/>
+        <w:jc w:val="center"/>
+      </w:pPr>
+      <w:r>
+        <w:rPr>
+          <w:b/>
+          <w:i w:val="0"/>
+          <w:sz w:val="28"/>
+          <w:u w:val="none"/>
+        </w:rPr>
+        <w:t>Feedback Note 4</w:t>
       </w:r>
     </w:p>
     <w:p>
@@ -2743,7 +3583,7 @@
           <w:sz w:val="28"/>
           <w:u w:val="none"/>
         </w:rPr>
-        <w:t>Feedback Note 4</w:t>
+        <w:t>Feedback Note 5</w:t>
       </w:r>
     </w:p>
     <w:p>
@@ -3490,7 +4330,7 @@
           <w:sz w:val="28"/>
           <w:u w:val="none"/>
         </w:rPr>
-        <w:t>Feedback Note 5</w:t>
+        <w:t>Feedback Note 6</w:t>
       </w:r>
     </w:p>
     <w:p>
@@ -4237,6 +5077,753 @@
         <w:t>DIET Tumakuru classroom observation practice; DSERT classroom observation Google Form.</w:t>
       </w:r>
     </w:p>
+    <w:p>
+      <w:r>
+        <w:br w:type="page"/>
+      </w:r>
+    </w:p>
+    <w:p>
+      <w:pPr>
+        <w:spacing w:after="120" w:before="0"/>
+        <w:jc w:val="right"/>
+      </w:pPr>
+      <w:r>
+        <w:rPr>
+          <w:b/>
+          <w:i w:val="0"/>
+          <w:u w:val="none"/>
+        </w:rPr>
+        <w:t>Annexure-1</w:t>
+      </w:r>
+    </w:p>
+    <w:p>
+      <w:pPr>
+        <w:spacing w:after="40" w:before="0"/>
+        <w:jc w:val="center"/>
+      </w:pPr>
+      <w:r>
+        <w:rPr>
+          <w:b/>
+          <w:i w:val="0"/>
+          <w:sz w:val="28"/>
+          <w:u w:val="none"/>
+        </w:rPr>
+        <w:t>Feedback Note 7</w:t>
+      </w:r>
+    </w:p>
+    <w:p>
+      <w:pPr>
+        <w:spacing w:after="160" w:before="0"/>
+        <w:jc w:val="center"/>
+      </w:pPr>
+      <w:r>
+        <w:rPr>
+          <w:b w:val="0"/>
+          <w:i/>
+          <w:sz w:val="20"/>
+          <w:u w:val="none"/>
+        </w:rPr>
+        <w:t>(by all IAS officers / State Department Officers / All Probationers of National and State Training Institutes and Academies)</w:t>
+      </w:r>
+    </w:p>
+    <w:p>
+      <w:pPr>
+        <w:spacing w:after="120" w:before="160"/>
+      </w:pPr>
+      <w:r>
+        <w:rPr>
+          <w:b/>
+          <w:i w:val="0"/>
+          <w:sz w:val="24"/>
+          <w:u w:val="none"/>
+        </w:rPr>
+        <w:t>Section 1: Officer Name and Details</w:t>
+      </w:r>
+    </w:p>
+    <w:tbl>
+      <w:tblPr>
+        <w:tblW w:type="auto" w:w="0"/>
+        <w:tblLook w:firstColumn="1" w:firstRow="1" w:lastColumn="0" w:lastRow="0" w:noHBand="0" w:noVBand="1" w:val="04A0"/>
+        <w:tblBorders>
+          <w:top w:val="single" w:sz="4" w:color="000000"/>
+          <w:left w:val="single" w:sz="4" w:color="000000"/>
+          <w:bottom w:val="single" w:sz="4" w:color="000000"/>
+          <w:right w:val="single" w:sz="4" w:color="000000"/>
+          <w:insideH w:val="single" w:sz="4" w:color="000000"/>
+          <w:insideV w:val="single" w:sz="4" w:color="000000"/>
+        </w:tblBorders>
+      </w:tblPr>
+      <w:tblGrid>
+        <w:gridCol w:w="4513"/>
+        <w:gridCol w:w="4513"/>
+      </w:tblGrid>
+      <w:tr>
+        <w:tc>
+          <w:tcPr>
+            <w:tcW w:type="dxa" w:w="3312"/>
+            <w:shd w:val="clear" w:color="auto" w:fill="F2F2F2"/>
+          </w:tcPr>
+          <w:p>
+            <w:pPr>
+              <w:spacing w:after="0"/>
+            </w:pPr>
+            <w:r/>
+            <w:r>
+              <w:rPr>
+                <w:b/>
+              </w:rPr>
+              <w:t>Name</w:t>
+            </w:r>
+          </w:p>
+        </w:tc>
+        <w:tc>
+          <w:tcPr>
+            <w:tcW w:type="dxa" w:w="5760"/>
+          </w:tcPr>
+          <w:p>
+            <w:pPr>
+              <w:spacing w:after="0"/>
+            </w:pPr>
+            <w:r/>
+            <w:r>
+              <w:t>Dr. Padmashree R.P.</w:t>
+            </w:r>
+          </w:p>
+        </w:tc>
+      </w:tr>
+      <w:tr>
+        <w:tc>
+          <w:tcPr>
+            <w:tcW w:type="dxa" w:w="3312"/>
+            <w:shd w:val="clear" w:color="auto" w:fill="F2F2F2"/>
+          </w:tcPr>
+          <w:p>
+            <w:pPr>
+              <w:spacing w:after="0"/>
+            </w:pPr>
+            <w:r/>
+            <w:r>
+              <w:rPr>
+                <w:b/>
+              </w:rPr>
+              <w:t>Designation</w:t>
+            </w:r>
+          </w:p>
+        </w:tc>
+        <w:tc>
+          <w:tcPr>
+            <w:tcW w:type="dxa" w:w="5760"/>
+          </w:tcPr>
+          <w:p>
+            <w:pPr>
+              <w:spacing w:after="0"/>
+            </w:pPr>
+            <w:r/>
+            <w:r>
+              <w:t>Senior Assistant Director, Teacher Education and Research Wing</w:t>
+            </w:r>
+          </w:p>
+        </w:tc>
+      </w:tr>
+      <w:tr>
+        <w:tc>
+          <w:tcPr>
+            <w:tcW w:type="dxa" w:w="3312"/>
+            <w:shd w:val="clear" w:color="auto" w:fill="F2F2F2"/>
+          </w:tcPr>
+          <w:p>
+            <w:pPr>
+              <w:spacing w:after="0"/>
+            </w:pPr>
+            <w:r/>
+            <w:r>
+              <w:rPr>
+                <w:b/>
+              </w:rPr>
+              <w:t>Batch</w:t>
+            </w:r>
+          </w:p>
+        </w:tc>
+        <w:tc>
+          <w:tcPr>
+            <w:tcW w:type="dxa" w:w="5760"/>
+          </w:tcPr>
+          <w:p>
+            <w:pPr>
+              <w:spacing w:after="0"/>
+            </w:pPr>
+            <w:r/>
+            <w:r>
+              <w:t>Not applicable (State Government officer)</w:t>
+            </w:r>
+          </w:p>
+        </w:tc>
+      </w:tr>
+      <w:tr>
+        <w:tc>
+          <w:tcPr>
+            <w:tcW w:type="dxa" w:w="3312"/>
+            <w:shd w:val="clear" w:color="auto" w:fill="F2F2F2"/>
+          </w:tcPr>
+          <w:p>
+            <w:pPr>
+              <w:spacing w:after="0"/>
+            </w:pPr>
+            <w:r/>
+            <w:r>
+              <w:rPr>
+                <w:b/>
+              </w:rPr>
+              <w:t>Current service status</w:t>
+            </w:r>
+          </w:p>
+        </w:tc>
+        <w:tc>
+          <w:tcPr>
+            <w:tcW w:type="dxa" w:w="5760"/>
+          </w:tcPr>
+          <w:p>
+            <w:pPr>
+              <w:spacing w:after="0"/>
+            </w:pPr>
+            <w:r/>
+            <w:r>
+              <w:t>☐ Probationer   ☒ Confirmed</w:t>
+            </w:r>
+          </w:p>
+        </w:tc>
+      </w:tr>
+      <w:tr>
+        <w:tc>
+          <w:tcPr>
+            <w:tcW w:type="dxa" w:w="3312"/>
+            <w:shd w:val="clear" w:color="auto" w:fill="F2F2F2"/>
+          </w:tcPr>
+          <w:p>
+            <w:pPr>
+              <w:spacing w:after="0"/>
+            </w:pPr>
+            <w:r/>
+            <w:r>
+              <w:rPr>
+                <w:b/>
+              </w:rPr>
+              <w:t>Training Institute / Academy (if currently undergoing institutional training)</w:t>
+            </w:r>
+          </w:p>
+        </w:tc>
+        <w:tc>
+          <w:tcPr>
+            <w:tcW w:type="dxa" w:w="5760"/>
+          </w:tcPr>
+          <w:p>
+            <w:pPr>
+              <w:spacing w:after="0"/>
+            </w:pPr>
+            <w:r/>
+            <w:r>
+              <w:t>Not applicable</w:t>
+            </w:r>
+          </w:p>
+        </w:tc>
+      </w:tr>
+      <w:tr>
+        <w:tc>
+          <w:tcPr>
+            <w:tcW w:type="dxa" w:w="3312"/>
+            <w:shd w:val="clear" w:color="auto" w:fill="F2F2F2"/>
+          </w:tcPr>
+          <w:p>
+            <w:pPr>
+              <w:spacing w:after="0"/>
+            </w:pPr>
+            <w:r/>
+            <w:r>
+              <w:rPr>
+                <w:b/>
+              </w:rPr>
+              <w:t>Current Posting</w:t>
+            </w:r>
+          </w:p>
+        </w:tc>
+        <w:tc>
+          <w:tcPr>
+            <w:tcW w:type="dxa" w:w="5760"/>
+          </w:tcPr>
+          <w:p>
+            <w:pPr>
+              <w:spacing w:after="0"/>
+            </w:pPr>
+            <w:r/>
+            <w:r>
+              <w:t>DSERT, Bengaluru</w:t>
+            </w:r>
+          </w:p>
+        </w:tc>
+      </w:tr>
+    </w:tbl>
+    <w:p>
+      <w:pPr>
+        <w:spacing w:after="120" w:before="160"/>
+      </w:pPr>
+      <w:r>
+        <w:rPr>
+          <w:b/>
+          <w:i w:val="0"/>
+          <w:sz w:val="24"/>
+          <w:u w:val="none"/>
+        </w:rPr>
+        <w:t>Section 2: Feedback for Sixth National Conference of Chief Secretaries</w:t>
+      </w:r>
+    </w:p>
+    <w:p>
+      <w:pPr>
+        <w:spacing w:after="120" w:before="160"/>
+      </w:pPr>
+      <w:r>
+        <w:rPr>
+          <w:b/>
+          <w:i w:val="0"/>
+          <w:sz w:val="24"/>
+          <w:u w:val="none"/>
+        </w:rPr>
+        <w:t>1. Name of the topic</w:t>
+      </w:r>
+    </w:p>
+    <w:p>
+      <w:pPr>
+        <w:spacing w:after="80" w:before="0"/>
+      </w:pPr>
+      <w:r>
+        <w:rPr>
+          <w:b w:val="0"/>
+          <w:i/>
+          <w:sz w:val="20"/>
+          <w:u w:val="none"/>
+        </w:rPr>
+        <w:t>(Choose from the topics of the conference)</w:t>
+      </w:r>
+    </w:p>
+    <w:tbl>
+      <w:tblPr>
+        <w:tblW w:type="auto" w:w="0"/>
+        <w:tblLook w:firstColumn="1" w:firstRow="1" w:lastColumn="0" w:lastRow="0" w:noHBand="0" w:noVBand="1" w:val="04A0"/>
+        <w:tblBorders>
+          <w:top w:val="single" w:sz="6" w:color="000000"/>
+          <w:left w:val="single" w:sz="6" w:color="000000"/>
+          <w:bottom w:val="single" w:sz="6" w:color="000000"/>
+          <w:right w:val="single" w:sz="6" w:color="000000"/>
+          <w:insideH w:val="single" w:sz="6" w:color="000000"/>
+          <w:insideV w:val="single" w:sz="6" w:color="000000"/>
+        </w:tblBorders>
+      </w:tblPr>
+      <w:tblGrid>
+        <w:gridCol w:w="9026"/>
+      </w:tblGrid>
+      <w:tr>
+        <w:tc>
+          <w:tcPr>
+            <w:tcW w:type="dxa" w:w="9026"/>
+          </w:tcPr>
+          <w:p>
+            <w:pPr>
+              <w:spacing w:after="60"/>
+              <w:jc w:val="both"/>
+            </w:pPr>
+            <w:r>
+              <w:rPr>
+                <w:b w:val="0"/>
+              </w:rPr>
+              <w:t>Human Development: Ensure Quality Education</w:t>
+            </w:r>
+          </w:p>
+          <w:p>
+            <w:pPr>
+              <w:spacing w:after="60"/>
+              <w:jc w:val="both"/>
+            </w:pPr>
+            <w:r>
+              <w:rPr>
+                <w:b/>
+              </w:rPr>
+              <w:t xml:space="preserve">Sub-topic: </w:t>
+            </w:r>
+            <w:r>
+              <w:rPr>
+                <w:b/>
+              </w:rPr>
+              <w:t>Research on the Monograde Transition</w:t>
+            </w:r>
+          </w:p>
+        </w:tc>
+      </w:tr>
+    </w:tbl>
+    <w:p>
+      <w:pPr>
+        <w:spacing w:after="120" w:before="160"/>
+      </w:pPr>
+      <w:r>
+        <w:rPr>
+          <w:b/>
+          <w:i w:val="0"/>
+          <w:sz w:val="24"/>
+          <w:u w:val="none"/>
+        </w:rPr>
+        <w:t>2. Policy Gaps and Challenges</w:t>
+      </w:r>
+    </w:p>
+    <w:p>
+      <w:pPr>
+        <w:spacing w:after="80" w:before="0"/>
+      </w:pPr>
+      <w:r>
+        <w:rPr>
+          <w:b w:val="0"/>
+          <w:i/>
+          <w:sz w:val="20"/>
+          <w:u w:val="none"/>
+        </w:rPr>
+        <w:t>(Current policy challenges, administrative and implementing challenges with respect to the topic selected)</w:t>
+      </w:r>
+    </w:p>
+    <w:tbl>
+      <w:tblPr>
+        <w:tblW w:type="auto" w:w="0"/>
+        <w:tblLook w:firstColumn="1" w:firstRow="1" w:lastColumn="0" w:lastRow="0" w:noHBand="0" w:noVBand="1" w:val="04A0"/>
+        <w:tblBorders>
+          <w:top w:val="single" w:sz="6" w:color="000000"/>
+          <w:left w:val="single" w:sz="6" w:color="000000"/>
+          <w:bottom w:val="single" w:sz="6" w:color="000000"/>
+          <w:right w:val="single" w:sz="6" w:color="000000"/>
+          <w:insideH w:val="single" w:sz="6" w:color="000000"/>
+          <w:insideV w:val="single" w:sz="6" w:color="000000"/>
+        </w:tblBorders>
+      </w:tblPr>
+      <w:tblGrid>
+        <w:gridCol w:w="9026"/>
+      </w:tblGrid>
+      <w:tr>
+        <w:tc>
+          <w:tcPr>
+            <w:tcW w:type="dxa" w:w="9026"/>
+          </w:tcPr>
+          <w:p>
+            <w:pPr>
+              <w:spacing w:after="60"/>
+              <w:jc w:val="both"/>
+            </w:pPr>
+            <w:r>
+              <w:rPr>
+                <w:b w:val="0"/>
+              </w:rPr>
+              <w:t>The shift from multigrade to monograde classrooms is one of the largest changes in primary education in Karnataka in recent years. Yet the evidence base is thin. Earlier DIET studies of primary classroom practice were mostly perception and implementation studies without comparison groups to measure learning.</w:t>
+            </w:r>
+          </w:p>
+          <w:p>
+            <w:pPr>
+              <w:spacing w:after="60"/>
+              <w:jc w:val="both"/>
+            </w:pPr>
+            <w:r>
+              <w:rPr>
+                <w:b w:val="0"/>
+              </w:rPr>
+              <w:t>None of the 234 studies in the DSERT Research Abstracts Compilation 2024-25 and 2025-26 examines the transition itself. Questions such as teacher readiness, the teacher-class ratio in small schools, infrastructure gaps, FLN outcomes before and after the change, and how single-teacher schools manage monograde teaching remain unanswered.</w:t>
+            </w:r>
+          </w:p>
+        </w:tc>
+      </w:tr>
+    </w:tbl>
+    <w:p>
+      <w:pPr>
+        <w:spacing w:after="120" w:before="160"/>
+      </w:pPr>
+      <w:r>
+        <w:rPr>
+          <w:b/>
+          <w:i w:val="0"/>
+          <w:sz w:val="24"/>
+          <w:u w:val="none"/>
+        </w:rPr>
+        <w:t>3. Potential Solutions</w:t>
+      </w:r>
+    </w:p>
+    <w:p>
+      <w:pPr>
+        <w:spacing w:after="80" w:before="0"/>
+      </w:pPr>
+      <w:r>
+        <w:rPr>
+          <w:b w:val="0"/>
+          <w:i/>
+          <w:sz w:val="20"/>
+          <w:u w:val="none"/>
+        </w:rPr>
+        <w:t>(Can potentially highlight new technology solutions, scope for convergence with other schemes/ programmes, etc.)</w:t>
+      </w:r>
+    </w:p>
+    <w:tbl>
+      <w:tblPr>
+        <w:tblW w:type="auto" w:w="0"/>
+        <w:tblLook w:firstColumn="1" w:firstRow="1" w:lastColumn="0" w:lastRow="0" w:noHBand="0" w:noVBand="1" w:val="04A0"/>
+        <w:tblBorders>
+          <w:top w:val="single" w:sz="6" w:color="000000"/>
+          <w:left w:val="single" w:sz="6" w:color="000000"/>
+          <w:bottom w:val="single" w:sz="6" w:color="000000"/>
+          <w:right w:val="single" w:sz="6" w:color="000000"/>
+          <w:insideH w:val="single" w:sz="6" w:color="000000"/>
+          <w:insideV w:val="single" w:sz="6" w:color="000000"/>
+        </w:tblBorders>
+      </w:tblPr>
+      <w:tblGrid>
+        <w:gridCol w:w="9026"/>
+      </w:tblGrid>
+      <w:tr>
+        <w:tc>
+          <w:tcPr>
+            <w:tcW w:type="dxa" w:w="9026"/>
+          </w:tcPr>
+          <w:p>
+            <w:pPr>
+              <w:spacing w:after="60"/>
+              <w:ind w:left="360" w:hanging="259"/>
+              <w:jc w:val="both"/>
+            </w:pPr>
+            <w:r>
+              <w:rPr>
+                <w:b w:val="0"/>
+              </w:rPr>
+              <w:t xml:space="preserve">•  </w:t>
+            </w:r>
+            <w:r>
+              <w:rPr>
+                <w:b w:val="0"/>
+              </w:rPr>
+              <w:t>Include the monograde transition as a priority area in the State Research Programme.</w:t>
+            </w:r>
+          </w:p>
+          <w:p>
+            <w:pPr>
+              <w:spacing w:after="60"/>
+              <w:ind w:left="360" w:hanging="259"/>
+              <w:jc w:val="both"/>
+            </w:pPr>
+            <w:r>
+              <w:rPr>
+                <w:b w:val="0"/>
+              </w:rPr>
+              <w:t xml:space="preserve">•  </w:t>
+            </w:r>
+            <w:r>
+              <w:rPr>
+                <w:b w:val="0"/>
+              </w:rPr>
+              <w:t>Conduct a taluk-level baseline study in 2026-27 while the transition is in progress.</w:t>
+            </w:r>
+          </w:p>
+          <w:p>
+            <w:pPr>
+              <w:spacing w:after="60"/>
+              <w:ind w:left="360" w:hanging="259"/>
+              <w:jc w:val="both"/>
+            </w:pPr>
+            <w:r>
+              <w:rPr>
+                <w:b w:val="0"/>
+              </w:rPr>
+              <w:t xml:space="preserve">•  </w:t>
+            </w:r>
+            <w:r>
+              <w:rPr>
+                <w:b w:val="0"/>
+              </w:rPr>
+              <w:t>Compare learning outcomes of children before and after the change, using comparison groups.</w:t>
+            </w:r>
+          </w:p>
+          <w:p>
+            <w:pPr>
+              <w:spacing w:after="60"/>
+              <w:ind w:left="360" w:hanging="259"/>
+              <w:jc w:val="both"/>
+            </w:pPr>
+            <w:r>
+              <w:rPr>
+                <w:b w:val="0"/>
+              </w:rPr>
+              <w:t xml:space="preserve">•  </w:t>
+            </w:r>
+            <w:r>
+              <w:rPr>
+                <w:b w:val="0"/>
+              </w:rPr>
+              <w:t>Study teacher readiness, workload and training needs in monograde classes.</w:t>
+            </w:r>
+          </w:p>
+          <w:p>
+            <w:pPr>
+              <w:spacing w:after="60"/>
+              <w:ind w:left="360" w:hanging="259"/>
+              <w:jc w:val="both"/>
+            </w:pPr>
+            <w:r>
+              <w:rPr>
+                <w:b w:val="0"/>
+              </w:rPr>
+              <w:t xml:space="preserve">•  </w:t>
+            </w:r>
+            <w:r>
+              <w:rPr>
+                <w:b w:val="0"/>
+              </w:rPr>
+              <w:t>Study how small and single-teacher schools are managing the change.</w:t>
+            </w:r>
+          </w:p>
+          <w:p>
+            <w:pPr>
+              <w:spacing w:after="60"/>
+              <w:ind w:left="360" w:hanging="259"/>
+              <w:jc w:val="both"/>
+            </w:pPr>
+            <w:r>
+              <w:rPr>
+                <w:b w:val="0"/>
+              </w:rPr>
+              <w:t xml:space="preserve">•  </w:t>
+            </w:r>
+            <w:r>
+              <w:rPr>
+                <w:b w:val="0"/>
+              </w:rPr>
+              <w:t>Record infrastructure gaps and how schools are solving them.</w:t>
+            </w:r>
+          </w:p>
+          <w:p>
+            <w:pPr>
+              <w:spacing w:after="60"/>
+              <w:ind w:left="360" w:hanging="259"/>
+              <w:jc w:val="both"/>
+            </w:pPr>
+            <w:r>
+              <w:rPr>
+                <w:b w:val="0"/>
+              </w:rPr>
+              <w:t xml:space="preserve">•  </w:t>
+            </w:r>
+            <w:r>
+              <w:rPr>
+                <w:b w:val="0"/>
+              </w:rPr>
+              <w:t>Share findings through policy briefs, the State research symposium and district plans.</w:t>
+            </w:r>
+          </w:p>
+        </w:tc>
+      </w:tr>
+    </w:tbl>
+    <w:p>
+      <w:pPr>
+        <w:spacing w:after="120" w:before="160"/>
+      </w:pPr>
+      <w:r>
+        <w:rPr>
+          <w:b/>
+          <w:i w:val="0"/>
+          <w:sz w:val="24"/>
+          <w:u w:val="none"/>
+        </w:rPr>
+        <w:t>4. Best Practices</w:t>
+      </w:r>
+    </w:p>
+    <w:p>
+      <w:pPr>
+        <w:spacing w:after="80" w:before="0"/>
+      </w:pPr>
+      <w:r>
+        <w:rPr>
+          <w:b w:val="0"/>
+          <w:i/>
+          <w:sz w:val="20"/>
+          <w:u w:val="none"/>
+        </w:rPr>
+        <w:t>(Highlights the practices, which are sustainable, replicable, scalable, monitorable, etc. Can also highlight the block/district/ State level practices)</w:t>
+      </w:r>
+    </w:p>
+    <w:tbl>
+      <w:tblPr>
+        <w:tblW w:type="auto" w:w="0"/>
+        <w:tblLook w:firstColumn="1" w:firstRow="1" w:lastColumn="0" w:lastRow="0" w:noHBand="0" w:noVBand="1" w:val="04A0"/>
+        <w:tblBorders>
+          <w:top w:val="single" w:sz="6" w:color="000000"/>
+          <w:left w:val="single" w:sz="6" w:color="000000"/>
+          <w:bottom w:val="single" w:sz="6" w:color="000000"/>
+          <w:right w:val="single" w:sz="6" w:color="000000"/>
+          <w:insideH w:val="single" w:sz="6" w:color="000000"/>
+          <w:insideV w:val="single" w:sz="6" w:color="000000"/>
+        </w:tblBorders>
+      </w:tblPr>
+      <w:tblGrid>
+        <w:gridCol w:w="9026"/>
+      </w:tblGrid>
+      <w:tr>
+        <w:tc>
+          <w:tcPr>
+            <w:tcW w:type="dxa" w:w="9026"/>
+          </w:tcPr>
+          <w:p>
+            <w:pPr>
+              <w:spacing w:after="60"/>
+              <w:jc w:val="both"/>
+            </w:pPr>
+            <w:r>
+              <w:rPr>
+                <w:b w:val="0"/>
+              </w:rPr>
+              <w:t>The DSERT Research Studies Tracker 2026-27 (as on 13 October 2026) already includes studies that will inform the transition. DIET Chitradurga is studying the challenges faced by teachers in monograde classes of Classes 1 to 5. DIET Mandya is studying the FLN achievement of children completing the foundational stage. DIET Gadag, DIET Tumakuru, DIET Bagalkote and DIET Shivamogga are studying Karnataka Public Schools, their conversion, institutional performance and leadership.</w:t>
+            </w:r>
+          </w:p>
+          <w:p>
+            <w:pPr>
+              <w:spacing w:after="60"/>
+              <w:jc w:val="both"/>
+            </w:pPr>
+            <w:r>
+              <w:rPr>
+                <w:b w:val="0"/>
+              </w:rPr>
+              <w:t>Each DIET is supported with up to Rs 10 lakh for research under Samagra Shiksha, with quarterly reports and final reports due in March 2027. This is a good example of building research into the implementation of a major reform. It can be monitored through the State Research Studies Tracker and the use of findings in district and State plans.</w:t>
+            </w:r>
+          </w:p>
+        </w:tc>
+      </w:tr>
+    </w:tbl>
+    <w:p>
+      <w:pPr>
+        <w:spacing w:after="120" w:before="160"/>
+      </w:pPr>
+      <w:r>
+        <w:rPr>
+          <w:b/>
+          <w:i w:val="0"/>
+          <w:sz w:val="24"/>
+          <w:u w:val="none"/>
+        </w:rPr>
+        <w:t>References</w:t>
+      </w:r>
+    </w:p>
+    <w:p>
+      <w:pPr>
+        <w:spacing w:after="60" w:before="0"/>
+        <w:ind w:left="576" w:hanging="576"/>
+        <w:jc w:val="both"/>
+      </w:pPr>
+      <w:r>
+        <w:rPr>
+          <w:b w:val="0"/>
+          <w:i w:val="0"/>
+          <w:u w:val="none"/>
+        </w:rPr>
+        <w:t>DSERT Research Studies Tracker 2026-27; DSERT Research Abstracts Compilation 2024-25 and 2025-26.</w:t>
+      </w:r>
+    </w:p>
     <w:sectPr>
       <w:footerReference w:type="default" r:id="rId9"/>
       <w:pgSz w:w="11906" w:h="16838"/>

</xml_diff>

<commit_message>
Start every Annexure-1 feedback note on a new page using page-break-before
Co-Authored-By: Claude Opus 5.5 <noreply@anthropic.com>
Claude-Session: https://claude.ai/code/session_01TmoA8EnDu8b3BBjWmeLWrr
</commit_message>
<xml_diff>
--- a/rewrites/cs-conference-feedback/Monograde_Education_Feedback_Notes_Annexure1.docx
+++ b/rewrites/cs-conference-feedback/Monograde_Education_Feedback_Notes_Annexure1.docx
@@ -584,12 +584,8 @@
       </w:tr>
     </w:tbl>
     <w:p>
-      <w:r>
-        <w:br w:type="page"/>
-      </w:r>
-    </w:p>
-    <w:p>
       <w:pPr>
+        <w:pageBreakBefore/>
         <w:spacing w:after="120" w:before="0"/>
         <w:jc w:val="right"/>
       </w:pPr>
@@ -1331,12 +1327,8 @@
       </w:r>
     </w:p>
     <w:p>
-      <w:r>
-        <w:br w:type="page"/>
-      </w:r>
-    </w:p>
-    <w:p>
       <w:pPr>
+        <w:pageBreakBefore/>
         <w:spacing w:after="120" w:before="0"/>
         <w:jc w:val="right"/>
       </w:pPr>
@@ -2059,12 +2051,8 @@
       </w:r>
     </w:p>
     <w:p>
-      <w:r>
-        <w:br w:type="page"/>
-      </w:r>
-    </w:p>
-    <w:p>
       <w:pPr>
+        <w:pageBreakBefore/>
         <w:spacing w:after="120" w:before="0"/>
         <w:jc w:val="right"/>
       </w:pPr>
@@ -2806,12 +2794,8 @@
       </w:r>
     </w:p>
     <w:p>
-      <w:r>
-        <w:br w:type="page"/>
-      </w:r>
-    </w:p>
-    <w:p>
       <w:pPr>
+        <w:pageBreakBefore/>
         <w:spacing w:after="120" w:before="0"/>
         <w:jc w:val="right"/>
       </w:pPr>
@@ -3553,12 +3537,8 @@
       </w:r>
     </w:p>
     <w:p>
-      <w:r>
-        <w:br w:type="page"/>
-      </w:r>
-    </w:p>
-    <w:p>
       <w:pPr>
+        <w:pageBreakBefore/>
         <w:spacing w:after="120" w:before="0"/>
         <w:jc w:val="right"/>
       </w:pPr>
@@ -4300,12 +4280,8 @@
       </w:r>
     </w:p>
     <w:p>
-      <w:r>
-        <w:br w:type="page"/>
-      </w:r>
-    </w:p>
-    <w:p>
       <w:pPr>
+        <w:pageBreakBefore/>
         <w:spacing w:after="120" w:before="0"/>
         <w:jc w:val="right"/>
       </w:pPr>
@@ -5078,12 +5054,8 @@
       </w:r>
     </w:p>
     <w:p>
-      <w:r>
-        <w:br w:type="page"/>
-      </w:r>
-    </w:p>
-    <w:p>
       <w:pPr>
+        <w:pageBreakBefore/>
         <w:spacing w:after="120" w:before="0"/>
         <w:jc w:val="right"/>
       </w:pPr>

</xml_diff>